<commit_message>
feat(): All admin added
</commit_message>
<xml_diff>
--- a/ArielProject/מפת אתר!.docx
+++ b/ArielProject/מפת אתר!.docx
@@ -8,6 +8,722 @@
           <w:rtl/>
         </w:rPr>
       </w:pPr>
+      <w:r>
+        <w:rPr>
+          <w:rFonts w:hint="cs"/>
+          <w:b/>
+          <w:bCs/>
+          <w:noProof/>
+          <w:sz w:val="44"/>
+          <w:szCs w:val="44"/>
+          <w:u w:val="single"/>
+          <w:rtl/>
+          <w:lang w:val="he-IL"/>
+        </w:rPr>
+        <mc:AlternateContent>
+          <mc:Choice Requires="wps">
+            <w:drawing>
+              <wp:anchor distT="0" distB="0" distL="114300" distR="114300" simplePos="0" relativeHeight="251711488" behindDoc="0" locked="0" layoutInCell="1" allowOverlap="1" wp14:anchorId="727D8BF8" wp14:editId="352A8877">
+                <wp:simplePos x="0" y="0"/>
+                <wp:positionH relativeFrom="column">
+                  <wp:posOffset>3832860</wp:posOffset>
+                </wp:positionH>
+                <wp:positionV relativeFrom="paragraph">
+                  <wp:posOffset>4859020</wp:posOffset>
+                </wp:positionV>
+                <wp:extent cx="377825" cy="552450"/>
+                <wp:effectExtent l="38100" t="0" r="22225" b="57150"/>
+                <wp:wrapTight wrapText="bothSides">
+                  <wp:wrapPolygon edited="0">
+                    <wp:start x="18514" y="0"/>
+                    <wp:lineTo x="6534" y="0"/>
+                    <wp:lineTo x="6534" y="11917"/>
+                    <wp:lineTo x="-2178" y="11917"/>
+                    <wp:lineTo x="-2178" y="23090"/>
+                    <wp:lineTo x="3267" y="23090"/>
+                    <wp:lineTo x="13069" y="11917"/>
+                    <wp:lineTo x="21782" y="745"/>
+                    <wp:lineTo x="21782" y="0"/>
+                    <wp:lineTo x="18514" y="0"/>
+                  </wp:wrapPolygon>
+                </wp:wrapTight>
+                <wp:docPr id="30" name="מחבר חץ ישר 30"/>
+                <wp:cNvGraphicFramePr/>
+                <a:graphic xmlns:a="http://schemas.openxmlformats.org/drawingml/2006/main">
+                  <a:graphicData uri="http://schemas.microsoft.com/office/word/2010/wordprocessingShape">
+                    <wps:wsp>
+                      <wps:cNvCnPr/>
+                      <wps:spPr>
+                        <a:xfrm flipH="1">
+                          <a:off x="0" y="0"/>
+                          <a:ext cx="377825" cy="552450"/>
+                        </a:xfrm>
+                        <a:prstGeom prst="straightConnector1">
+                          <a:avLst/>
+                        </a:prstGeom>
+                        <a:ln>
+                          <a:tailEnd type="triangle"/>
+                        </a:ln>
+                      </wps:spPr>
+                      <wps:style>
+                        <a:lnRef idx="1">
+                          <a:schemeClr val="dk1"/>
+                        </a:lnRef>
+                        <a:fillRef idx="0">
+                          <a:schemeClr val="dk1"/>
+                        </a:fillRef>
+                        <a:effectRef idx="0">
+                          <a:schemeClr val="dk1"/>
+                        </a:effectRef>
+                        <a:fontRef idx="minor">
+                          <a:schemeClr val="tx1"/>
+                        </a:fontRef>
+                      </wps:style>
+                      <wps:bodyPr/>
+                    </wps:wsp>
+                  </a:graphicData>
+                </a:graphic>
+                <wp14:sizeRelH relativeFrom="margin">
+                  <wp14:pctWidth>0</wp14:pctWidth>
+                </wp14:sizeRelH>
+                <wp14:sizeRelV relativeFrom="margin">
+                  <wp14:pctHeight>0</wp14:pctHeight>
+                </wp14:sizeRelV>
+              </wp:anchor>
+            </w:drawing>
+          </mc:Choice>
+          <mc:Fallback>
+            <w:pict>
+              <v:shapetype w14:anchorId="5F77ECB6" id="_x0000_t32" coordsize="21600,21600" o:spt="32" o:oned="t" path="m,l21600,21600e" filled="f">
+                <v:path arrowok="t" fillok="f" o:connecttype="none"/>
+                <o:lock v:ext="edit" shapetype="t"/>
+              </v:shapetype>
+              <v:shape id="מחבר חץ ישר 30" o:spid="_x0000_s1026" type="#_x0000_t32" style="position:absolute;margin-left:301.8pt;margin-top:382.6pt;width:29.75pt;height:43.5pt;flip:x;z-index:251711488;visibility:visible;mso-wrap-style:square;mso-width-percent:0;mso-height-percent:0;mso-wrap-distance-left:9pt;mso-wrap-distance-top:0;mso-wrap-distance-right:9pt;mso-wrap-distance-bottom:0;mso-position-horizontal:absolute;mso-position-horizontal-relative:text;mso-position-vertical:absolute;mso-position-vertical-relative:text;mso-width-percent:0;mso-height-percent:0;mso-width-relative:margin;mso-height-relative:margin" o:gfxdata="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" strokecolor="black [3200]" strokeweight=".5pt">
+                <v:stroke endarrow="block" joinstyle="miter"/>
+                <w10:wrap type="tight"/>
+              </v:shape>
+            </w:pict>
+          </mc:Fallback>
+        </mc:AlternateContent>
+      </w:r>
+      <w:r>
+        <w:rPr>
+          <w:rFonts w:hint="cs"/>
+          <w:b/>
+          <w:bCs/>
+          <w:noProof/>
+          <w:sz w:val="44"/>
+          <w:szCs w:val="44"/>
+          <w:u w:val="single"/>
+          <w:rtl/>
+          <w:lang w:val="he-IL"/>
+        </w:rPr>
+        <mc:AlternateContent>
+          <mc:Choice Requires="wps">
+            <w:drawing>
+              <wp:anchor distT="0" distB="0" distL="114300" distR="114300" simplePos="0" relativeHeight="251713536" behindDoc="0" locked="0" layoutInCell="1" allowOverlap="1" wp14:anchorId="54A8EB79" wp14:editId="4597858E">
+                <wp:simplePos x="0" y="0"/>
+                <wp:positionH relativeFrom="margin">
+                  <wp:posOffset>3075644</wp:posOffset>
+                </wp:positionH>
+                <wp:positionV relativeFrom="paragraph">
+                  <wp:posOffset>5622792</wp:posOffset>
+                </wp:positionV>
+                <wp:extent cx="1153795" cy="510540"/>
+                <wp:effectExtent l="0" t="0" r="27305" b="22860"/>
+                <wp:wrapTight wrapText="bothSides">
+                  <wp:wrapPolygon edited="0">
+                    <wp:start x="0" y="0"/>
+                    <wp:lineTo x="0" y="21761"/>
+                    <wp:lineTo x="21755" y="21761"/>
+                    <wp:lineTo x="21755" y="0"/>
+                    <wp:lineTo x="0" y="0"/>
+                  </wp:wrapPolygon>
+                </wp:wrapTight>
+                <wp:docPr id="31" name="מלבן: פינות מעוגלות 31"/>
+                <wp:cNvGraphicFramePr/>
+                <a:graphic xmlns:a="http://schemas.openxmlformats.org/drawingml/2006/main">
+                  <a:graphicData uri="http://schemas.microsoft.com/office/word/2010/wordprocessingShape">
+                    <wps:wsp>
+                      <wps:cNvSpPr/>
+                      <wps:spPr>
+                        <a:xfrm>
+                          <a:off x="0" y="0"/>
+                          <a:ext cx="1153795" cy="510540"/>
+                        </a:xfrm>
+                        <a:prstGeom prst="roundRect">
+                          <a:avLst/>
+                        </a:prstGeom>
+                        <a:solidFill>
+                          <a:schemeClr val="accent1">
+                            <a:lumMod val="50000"/>
+                          </a:schemeClr>
+                        </a:solidFill>
+                      </wps:spPr>
+                      <wps:style>
+                        <a:lnRef idx="2">
+                          <a:schemeClr val="accent6">
+                            <a:shade val="50000"/>
+                          </a:schemeClr>
+                        </a:lnRef>
+                        <a:fillRef idx="1">
+                          <a:schemeClr val="accent6"/>
+                        </a:fillRef>
+                        <a:effectRef idx="0">
+                          <a:schemeClr val="accent6"/>
+                        </a:effectRef>
+                        <a:fontRef idx="minor">
+                          <a:schemeClr val="lt1"/>
+                        </a:fontRef>
+                      </wps:style>
+                      <wps:txbx>
+                        <w:txbxContent>
+                          <w:p>
+                            <w:pPr>
+                              <w:jc w:val="center"/>
+                              <w:rPr>
+                                <w:sz w:val="20"/>
+                                <w:szCs w:val="20"/>
+                                <w:rtl/>
+                              </w:rPr>
+                            </w:pPr>
+                            <w:r>
+                              <w:rPr>
+                                <w:rFonts w:hint="cs"/>
+                                <w:sz w:val="20"/>
+                                <w:szCs w:val="20"/>
+                                <w:rtl/>
+                              </w:rPr>
+                              <w:t>הזמנת מקום</w:t>
+                            </w:r>
+                          </w:p>
+                        </w:txbxContent>
+                      </wps:txbx>
+                      <wps:bodyPr rot="0" spcFirstLastPara="0" vertOverflow="overflow" horzOverflow="overflow" vert="horz" wrap="square" lIns="91440" tIns="45720" rIns="91440" bIns="45720" numCol="1" spcCol="0" rtlCol="1" fromWordArt="0" anchor="ctr" anchorCtr="0" forceAA="0" compatLnSpc="1">
+                        <a:prstTxWarp prst="textNoShape">
+                          <a:avLst/>
+                        </a:prstTxWarp>
+                        <a:noAutofit/>
+                      </wps:bodyPr>
+                    </wps:wsp>
+                  </a:graphicData>
+                </a:graphic>
+                <wp14:sizeRelH relativeFrom="margin">
+                  <wp14:pctWidth>0</wp14:pctWidth>
+                </wp14:sizeRelH>
+                <wp14:sizeRelV relativeFrom="margin">
+                  <wp14:pctHeight>0</wp14:pctHeight>
+                </wp14:sizeRelV>
+              </wp:anchor>
+            </w:drawing>
+          </mc:Choice>
+          <mc:Fallback>
+            <w:pict>
+              <v:roundrect w14:anchorId="54A8EB79" id="מלבן: פינות מעוגלות 31" o:spid="_x0000_s1026" style="position:absolute;left:0;text-align:left;margin-left:242.2pt;margin-top:442.75pt;width:90.85pt;height:40.2pt;z-index:251713536;visibility:visible;mso-wrap-style:square;mso-width-percent:0;mso-height-percent:0;mso-wrap-distance-left:9pt;mso-wrap-distance-top:0;mso-wrap-distance-right:9pt;mso-wrap-distance-bottom:0;mso-position-horizontal:absolute;mso-position-horizontal-relative:margin;mso-position-vertical:absolute;mso-position-vertical-relative:text;mso-width-percent:0;mso-height-percent:0;mso-width-relative:margin;mso-height-relative:margin;v-text-anchor:middle" arcsize="10923f" o:gfxdata="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" fillcolor="#1f3763 [1604]" strokecolor="#375623 [1609]" strokeweight="1pt">
+                <v:stroke joinstyle="miter"/>
+                <v:textbox>
+                  <w:txbxContent>
+                    <w:p>
+                      <w:pPr>
+                        <w:jc w:val="center"/>
+                        <w:rPr>
+                          <w:sz w:val="20"/>
+                          <w:szCs w:val="20"/>
+                          <w:rtl/>
+                        </w:rPr>
+                      </w:pPr>
+                      <w:r>
+                        <w:rPr>
+                          <w:rFonts w:hint="cs"/>
+                          <w:sz w:val="20"/>
+                          <w:szCs w:val="20"/>
+                          <w:rtl/>
+                        </w:rPr>
+                        <w:t>הזמנת מקום</w:t>
+                      </w:r>
+                    </w:p>
+                  </w:txbxContent>
+                </v:textbox>
+                <w10:wrap type="tight" anchorx="margin"/>
+              </v:roundrect>
+            </w:pict>
+          </mc:Fallback>
+        </mc:AlternateContent>
+      </w:r>
+      <w:r>
+        <w:rPr>
+          <w:rFonts w:hint="cs"/>
+          <w:b/>
+          <w:bCs/>
+          <w:noProof/>
+          <w:sz w:val="44"/>
+          <w:szCs w:val="44"/>
+          <w:u w:val="single"/>
+          <w:rtl/>
+          <w:lang w:val="he-IL"/>
+        </w:rPr>
+        <mc:AlternateContent>
+          <mc:Choice Requires="wps">
+            <w:drawing>
+              <wp:anchor distT="0" distB="0" distL="114300" distR="114300" simplePos="0" relativeHeight="251693056" behindDoc="0" locked="0" layoutInCell="1" allowOverlap="1" wp14:anchorId="58DAED1C" wp14:editId="77D365BE">
+                <wp:simplePos x="0" y="0"/>
+                <wp:positionH relativeFrom="margin">
+                  <wp:posOffset>558165</wp:posOffset>
+                </wp:positionH>
+                <wp:positionV relativeFrom="paragraph">
+                  <wp:posOffset>4539615</wp:posOffset>
+                </wp:positionV>
+                <wp:extent cx="445770" cy="478155"/>
+                <wp:effectExtent l="38100" t="0" r="30480" b="55245"/>
+                <wp:wrapTight wrapText="bothSides">
+                  <wp:wrapPolygon edited="0">
+                    <wp:start x="19385" y="0"/>
+                    <wp:lineTo x="5538" y="0"/>
+                    <wp:lineTo x="5538" y="13769"/>
+                    <wp:lineTo x="-1846" y="13769"/>
+                    <wp:lineTo x="-1846" y="23235"/>
+                    <wp:lineTo x="3692" y="23235"/>
+                    <wp:lineTo x="4615" y="21514"/>
+                    <wp:lineTo x="12000" y="13769"/>
+                    <wp:lineTo x="22154" y="861"/>
+                    <wp:lineTo x="22154" y="0"/>
+                    <wp:lineTo x="19385" y="0"/>
+                  </wp:wrapPolygon>
+                </wp:wrapTight>
+                <wp:docPr id="17" name="מחבר חץ ישר 17"/>
+                <wp:cNvGraphicFramePr/>
+                <a:graphic xmlns:a="http://schemas.openxmlformats.org/drawingml/2006/main">
+                  <a:graphicData uri="http://schemas.microsoft.com/office/word/2010/wordprocessingShape">
+                    <wps:wsp>
+                      <wps:cNvCnPr/>
+                      <wps:spPr>
+                        <a:xfrm flipH="1">
+                          <a:off x="0" y="0"/>
+                          <a:ext cx="445770" cy="478155"/>
+                        </a:xfrm>
+                        <a:prstGeom prst="straightConnector1">
+                          <a:avLst/>
+                        </a:prstGeom>
+                        <a:ln>
+                          <a:tailEnd type="triangle"/>
+                        </a:ln>
+                      </wps:spPr>
+                      <wps:style>
+                        <a:lnRef idx="1">
+                          <a:schemeClr val="dk1"/>
+                        </a:lnRef>
+                        <a:fillRef idx="0">
+                          <a:schemeClr val="dk1"/>
+                        </a:fillRef>
+                        <a:effectRef idx="0">
+                          <a:schemeClr val="dk1"/>
+                        </a:effectRef>
+                        <a:fontRef idx="minor">
+                          <a:schemeClr val="tx1"/>
+                        </a:fontRef>
+                      </wps:style>
+                      <wps:bodyPr/>
+                    </wps:wsp>
+                  </a:graphicData>
+                </a:graphic>
+                <wp14:sizeRelH relativeFrom="margin">
+                  <wp14:pctWidth>0</wp14:pctWidth>
+                </wp14:sizeRelH>
+                <wp14:sizeRelV relativeFrom="margin">
+                  <wp14:pctHeight>0</wp14:pctHeight>
+                </wp14:sizeRelV>
+              </wp:anchor>
+            </w:drawing>
+          </mc:Choice>
+          <mc:Fallback>
+            <w:pict>
+              <v:shape w14:anchorId="08F7B7EE" id="מחבר חץ ישר 17" o:spid="_x0000_s1026" type="#_x0000_t32" style="position:absolute;margin-left:43.95pt;margin-top:357.45pt;width:35.1pt;height:37.65pt;flip:x;z-index:251693056;visibility:visible;mso-wrap-style:square;mso-width-percent:0;mso-height-percent:0;mso-wrap-distance-left:9pt;mso-wrap-distance-top:0;mso-wrap-distance-right:9pt;mso-wrap-distance-bottom:0;mso-position-horizontal:absolute;mso-position-horizontal-relative:margin;mso-position-vertical:absolute;mso-position-vertical-relative:text;mso-width-percent:0;mso-height-percent:0;mso-width-relative:margin;mso-height-relative:margin" o:gfxdata="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" strokecolor="black [3200]" strokeweight=".5pt">
+                <v:stroke endarrow="block" joinstyle="miter"/>
+                <w10:wrap type="tight" anchorx="margin"/>
+              </v:shape>
+            </w:pict>
+          </mc:Fallback>
+        </mc:AlternateContent>
+      </w:r>
+      <w:r>
+        <w:rPr>
+          <w:rFonts w:hint="cs"/>
+          <w:b/>
+          <w:bCs/>
+          <w:noProof/>
+          <w:sz w:val="44"/>
+          <w:szCs w:val="44"/>
+          <w:u w:val="single"/>
+          <w:rtl/>
+          <w:lang w:val="he-IL"/>
+        </w:rPr>
+        <mc:AlternateContent>
+          <mc:Choice Requires="wps">
+            <w:drawing>
+              <wp:anchor distT="0" distB="0" distL="114300" distR="114300" simplePos="0" relativeHeight="251695104" behindDoc="0" locked="0" layoutInCell="1" allowOverlap="1" wp14:anchorId="303842B3" wp14:editId="6D9CBFEF">
+                <wp:simplePos x="0" y="0"/>
+                <wp:positionH relativeFrom="column">
+                  <wp:posOffset>-333980</wp:posOffset>
+                </wp:positionH>
+                <wp:positionV relativeFrom="paragraph">
+                  <wp:posOffset>5208108</wp:posOffset>
+                </wp:positionV>
+                <wp:extent cx="1153795" cy="510540"/>
+                <wp:effectExtent l="0" t="0" r="27305" b="22860"/>
+                <wp:wrapTight wrapText="bothSides">
+                  <wp:wrapPolygon edited="0">
+                    <wp:start x="0" y="0"/>
+                    <wp:lineTo x="0" y="21761"/>
+                    <wp:lineTo x="21755" y="21761"/>
+                    <wp:lineTo x="21755" y="0"/>
+                    <wp:lineTo x="0" y="0"/>
+                  </wp:wrapPolygon>
+                </wp:wrapTight>
+                <wp:docPr id="19" name="מלבן: פינות מעוגלות 19"/>
+                <wp:cNvGraphicFramePr/>
+                <a:graphic xmlns:a="http://schemas.openxmlformats.org/drawingml/2006/main">
+                  <a:graphicData uri="http://schemas.microsoft.com/office/word/2010/wordprocessingShape">
+                    <wps:wsp>
+                      <wps:cNvSpPr/>
+                      <wps:spPr>
+                        <a:xfrm>
+                          <a:off x="0" y="0"/>
+                          <a:ext cx="1153795" cy="510540"/>
+                        </a:xfrm>
+                        <a:prstGeom prst="roundRect">
+                          <a:avLst/>
+                        </a:prstGeom>
+                        <a:solidFill>
+                          <a:schemeClr val="accent1">
+                            <a:lumMod val="50000"/>
+                          </a:schemeClr>
+                        </a:solidFill>
+                      </wps:spPr>
+                      <wps:style>
+                        <a:lnRef idx="2">
+                          <a:schemeClr val="accent6">
+                            <a:shade val="50000"/>
+                          </a:schemeClr>
+                        </a:lnRef>
+                        <a:fillRef idx="1">
+                          <a:schemeClr val="accent6"/>
+                        </a:fillRef>
+                        <a:effectRef idx="0">
+                          <a:schemeClr val="accent6"/>
+                        </a:effectRef>
+                        <a:fontRef idx="minor">
+                          <a:schemeClr val="lt1"/>
+                        </a:fontRef>
+                      </wps:style>
+                      <wps:txbx>
+                        <w:txbxContent>
+                          <w:p>
+                            <w:pPr>
+                              <w:jc w:val="center"/>
+                              <w:rPr>
+                                <w:sz w:val="20"/>
+                                <w:szCs w:val="20"/>
+                                <w:rtl/>
+                              </w:rPr>
+                            </w:pPr>
+                            <w:r>
+                              <w:rPr>
+                                <w:rFonts w:hint="cs"/>
+                                <w:sz w:val="20"/>
+                                <w:szCs w:val="20"/>
+                                <w:rtl/>
+                              </w:rPr>
+                              <w:t>היסטוריית הזמנות</w:t>
+                            </w:r>
+                          </w:p>
+                        </w:txbxContent>
+                      </wps:txbx>
+                      <wps:bodyPr rot="0" spcFirstLastPara="0" vertOverflow="overflow" horzOverflow="overflow" vert="horz" wrap="square" lIns="91440" tIns="45720" rIns="91440" bIns="45720" numCol="1" spcCol="0" rtlCol="1" fromWordArt="0" anchor="ctr" anchorCtr="0" forceAA="0" compatLnSpc="1">
+                        <a:prstTxWarp prst="textNoShape">
+                          <a:avLst/>
+                        </a:prstTxWarp>
+                        <a:noAutofit/>
+                      </wps:bodyPr>
+                    </wps:wsp>
+                  </a:graphicData>
+                </a:graphic>
+                <wp14:sizeRelH relativeFrom="margin">
+                  <wp14:pctWidth>0</wp14:pctWidth>
+                </wp14:sizeRelH>
+                <wp14:sizeRelV relativeFrom="margin">
+                  <wp14:pctHeight>0</wp14:pctHeight>
+                </wp14:sizeRelV>
+              </wp:anchor>
+            </w:drawing>
+          </mc:Choice>
+          <mc:Fallback>
+            <w:pict>
+              <v:roundrect w14:anchorId="303842B3" id="מלבן: פינות מעוגלות 19" o:spid="_x0000_s1027" style="position:absolute;left:0;text-align:left;margin-left:-26.3pt;margin-top:410.1pt;width:90.85pt;height:40.2pt;z-index:251695104;visibility:visible;mso-wrap-style:square;mso-width-percent:0;mso-height-percent:0;mso-wrap-distance-left:9pt;mso-wrap-distance-top:0;mso-wrap-distance-right:9pt;mso-wrap-distance-bottom:0;mso-position-horizontal:absolute;mso-position-horizontal-relative:text;mso-position-vertical:absolute;mso-position-vertical-relative:text;mso-width-percent:0;mso-height-percent:0;mso-width-relative:margin;mso-height-relative:margin;v-text-anchor:middle" arcsize="10923f" o:gfxdata="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" fillcolor="#1f3763 [1604]" strokecolor="#375623 [1609]" strokeweight="1pt">
+                <v:stroke joinstyle="miter"/>
+                <v:textbox>
+                  <w:txbxContent>
+                    <w:p>
+                      <w:pPr>
+                        <w:jc w:val="center"/>
+                        <w:rPr>
+                          <w:sz w:val="20"/>
+                          <w:szCs w:val="20"/>
+                          <w:rtl/>
+                        </w:rPr>
+                      </w:pPr>
+                      <w:r>
+                        <w:rPr>
+                          <w:rFonts w:hint="cs"/>
+                          <w:sz w:val="20"/>
+                          <w:szCs w:val="20"/>
+                          <w:rtl/>
+                        </w:rPr>
+                        <w:t>היסטוריית הזמנות</w:t>
+                      </w:r>
+                    </w:p>
+                  </w:txbxContent>
+                </v:textbox>
+                <w10:wrap type="tight"/>
+              </v:roundrect>
+            </w:pict>
+          </mc:Fallback>
+        </mc:AlternateContent>
+      </w:r>
+      <w:r>
+        <w:rPr>
+          <w:rFonts w:hint="cs"/>
+          <w:b/>
+          <w:bCs/>
+          <w:noProof/>
+          <w:sz w:val="44"/>
+          <w:szCs w:val="44"/>
+          <w:u w:val="single"/>
+          <w:rtl/>
+          <w:lang w:val="he-IL"/>
+        </w:rPr>
+        <mc:AlternateContent>
+          <mc:Choice Requires="wps">
+            <w:drawing>
+              <wp:anchor distT="0" distB="0" distL="114300" distR="114300" simplePos="0" relativeHeight="251705344" behindDoc="0" locked="0" layoutInCell="1" allowOverlap="1" wp14:anchorId="7CB211FB" wp14:editId="2130ABE1">
+                <wp:simplePos x="0" y="0"/>
+                <wp:positionH relativeFrom="margin">
+                  <wp:posOffset>1100308</wp:posOffset>
+                </wp:positionH>
+                <wp:positionV relativeFrom="paragraph">
+                  <wp:posOffset>5198745</wp:posOffset>
+                </wp:positionV>
+                <wp:extent cx="1153795" cy="510540"/>
+                <wp:effectExtent l="0" t="0" r="27305" b="22860"/>
+                <wp:wrapTight wrapText="bothSides">
+                  <wp:wrapPolygon edited="0">
+                    <wp:start x="0" y="0"/>
+                    <wp:lineTo x="0" y="21761"/>
+                    <wp:lineTo x="21755" y="21761"/>
+                    <wp:lineTo x="21755" y="0"/>
+                    <wp:lineTo x="0" y="0"/>
+                  </wp:wrapPolygon>
+                </wp:wrapTight>
+                <wp:docPr id="24" name="מלבן: פינות מעוגלות 24"/>
+                <wp:cNvGraphicFramePr/>
+                <a:graphic xmlns:a="http://schemas.openxmlformats.org/drawingml/2006/main">
+                  <a:graphicData uri="http://schemas.microsoft.com/office/word/2010/wordprocessingShape">
+                    <wps:wsp>
+                      <wps:cNvSpPr/>
+                      <wps:spPr>
+                        <a:xfrm>
+                          <a:off x="0" y="0"/>
+                          <a:ext cx="1153795" cy="510540"/>
+                        </a:xfrm>
+                        <a:prstGeom prst="roundRect">
+                          <a:avLst/>
+                        </a:prstGeom>
+                        <a:solidFill>
+                          <a:schemeClr val="accent1">
+                            <a:lumMod val="50000"/>
+                          </a:schemeClr>
+                        </a:solidFill>
+                      </wps:spPr>
+                      <wps:style>
+                        <a:lnRef idx="2">
+                          <a:schemeClr val="accent6">
+                            <a:shade val="50000"/>
+                          </a:schemeClr>
+                        </a:lnRef>
+                        <a:fillRef idx="1">
+                          <a:schemeClr val="accent6"/>
+                        </a:fillRef>
+                        <a:effectRef idx="0">
+                          <a:schemeClr val="accent6"/>
+                        </a:effectRef>
+                        <a:fontRef idx="minor">
+                          <a:schemeClr val="lt1"/>
+                        </a:fontRef>
+                      </wps:style>
+                      <wps:txbx>
+                        <w:txbxContent>
+                          <w:p>
+                            <w:pPr>
+                              <w:jc w:val="center"/>
+                              <w:rPr>
+                                <w:sz w:val="20"/>
+                                <w:szCs w:val="20"/>
+                                <w:rtl/>
+                              </w:rPr>
+                            </w:pPr>
+                            <w:r>
+                              <w:rPr>
+                                <w:rFonts w:hint="cs"/>
+                                <w:sz w:val="20"/>
+                                <w:szCs w:val="20"/>
+                                <w:rtl/>
+                              </w:rPr>
+                              <w:t>עריכת הזמנה קיימת</w:t>
+                            </w:r>
+                          </w:p>
+                        </w:txbxContent>
+                      </wps:txbx>
+                      <wps:bodyPr rot="0" spcFirstLastPara="0" vertOverflow="overflow" horzOverflow="overflow" vert="horz" wrap="square" lIns="91440" tIns="45720" rIns="91440" bIns="45720" numCol="1" spcCol="0" rtlCol="1" fromWordArt="0" anchor="ctr" anchorCtr="0" forceAA="0" compatLnSpc="1">
+                        <a:prstTxWarp prst="textNoShape">
+                          <a:avLst/>
+                        </a:prstTxWarp>
+                        <a:noAutofit/>
+                      </wps:bodyPr>
+                    </wps:wsp>
+                  </a:graphicData>
+                </a:graphic>
+                <wp14:sizeRelH relativeFrom="margin">
+                  <wp14:pctWidth>0</wp14:pctWidth>
+                </wp14:sizeRelH>
+                <wp14:sizeRelV relativeFrom="margin">
+                  <wp14:pctHeight>0</wp14:pctHeight>
+                </wp14:sizeRelV>
+              </wp:anchor>
+            </w:drawing>
+          </mc:Choice>
+          <mc:Fallback>
+            <w:pict>
+              <v:roundrect w14:anchorId="7CB211FB" id="מלבן: פינות מעוגלות 24" o:spid="_x0000_s1028" style="position:absolute;left:0;text-align:left;margin-left:86.65pt;margin-top:409.35pt;width:90.85pt;height:40.2pt;z-index:251705344;visibility:visible;mso-wrap-style:square;mso-width-percent:0;mso-height-percent:0;mso-wrap-distance-left:9pt;mso-wrap-distance-top:0;mso-wrap-distance-right:9pt;mso-wrap-distance-bottom:0;mso-position-horizontal:absolute;mso-position-horizontal-relative:margin;mso-position-vertical:absolute;mso-position-vertical-relative:text;mso-width-percent:0;mso-height-percent:0;mso-width-relative:margin;mso-height-relative:margin;v-text-anchor:middle" arcsize="10923f" o:gfxdata="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" fillcolor="#1f3763 [1604]" strokecolor="#375623 [1609]" strokeweight="1pt">
+                <v:stroke joinstyle="miter"/>
+                <v:textbox>
+                  <w:txbxContent>
+                    <w:p>
+                      <w:pPr>
+                        <w:jc w:val="center"/>
+                        <w:rPr>
+                          <w:sz w:val="20"/>
+                          <w:szCs w:val="20"/>
+                          <w:rtl/>
+                        </w:rPr>
+                      </w:pPr>
+                      <w:r>
+                        <w:rPr>
+                          <w:rFonts w:hint="cs"/>
+                          <w:sz w:val="20"/>
+                          <w:szCs w:val="20"/>
+                          <w:rtl/>
+                        </w:rPr>
+                        <w:t>עריכת הזמנה קיימת</w:t>
+                      </w:r>
+                    </w:p>
+                  </w:txbxContent>
+                </v:textbox>
+                <w10:wrap type="tight" anchorx="margin"/>
+              </v:roundrect>
+            </w:pict>
+          </mc:Fallback>
+        </mc:AlternateContent>
+      </w:r>
+      <w:r>
+        <w:rPr>
+          <w:rFonts w:hint="cs"/>
+          <w:b/>
+          <w:bCs/>
+          <w:noProof/>
+          <w:sz w:val="44"/>
+          <w:szCs w:val="44"/>
+          <w:u w:val="single"/>
+          <w:rtl/>
+          <w:lang w:val="he-IL"/>
+        </w:rPr>
+        <mc:AlternateContent>
+          <mc:Choice Requires="wps">
+            <w:drawing>
+              <wp:anchor distT="0" distB="0" distL="114300" distR="114300" simplePos="0" relativeHeight="251703296" behindDoc="0" locked="0" layoutInCell="1" allowOverlap="1" wp14:anchorId="5069027B" wp14:editId="41DC8D82">
+                <wp:simplePos x="0" y="0"/>
+                <wp:positionH relativeFrom="margin">
+                  <wp:posOffset>1504315</wp:posOffset>
+                </wp:positionH>
+                <wp:positionV relativeFrom="paragraph">
+                  <wp:posOffset>4561190</wp:posOffset>
+                </wp:positionV>
+                <wp:extent cx="84455" cy="435610"/>
+                <wp:effectExtent l="0" t="0" r="67945" b="59690"/>
+                <wp:wrapTight wrapText="bothSides">
+                  <wp:wrapPolygon edited="0">
+                    <wp:start x="0" y="0"/>
+                    <wp:lineTo x="0" y="4723"/>
+                    <wp:lineTo x="9744" y="23615"/>
+                    <wp:lineTo x="34105" y="23615"/>
+                    <wp:lineTo x="34105" y="17003"/>
+                    <wp:lineTo x="14617" y="0"/>
+                    <wp:lineTo x="0" y="0"/>
+                  </wp:wrapPolygon>
+                </wp:wrapTight>
+                <wp:docPr id="23" name="מחבר חץ ישר 23"/>
+                <wp:cNvGraphicFramePr/>
+                <a:graphic xmlns:a="http://schemas.openxmlformats.org/drawingml/2006/main">
+                  <a:graphicData uri="http://schemas.microsoft.com/office/word/2010/wordprocessingShape">
+                    <wps:wsp>
+                      <wps:cNvCnPr/>
+                      <wps:spPr>
+                        <a:xfrm>
+                          <a:off x="0" y="0"/>
+                          <a:ext cx="84455" cy="435610"/>
+                        </a:xfrm>
+                        <a:prstGeom prst="straightConnector1">
+                          <a:avLst/>
+                        </a:prstGeom>
+                        <a:ln>
+                          <a:tailEnd type="triangle"/>
+                        </a:ln>
+                      </wps:spPr>
+                      <wps:style>
+                        <a:lnRef idx="1">
+                          <a:schemeClr val="dk1"/>
+                        </a:lnRef>
+                        <a:fillRef idx="0">
+                          <a:schemeClr val="dk1"/>
+                        </a:fillRef>
+                        <a:effectRef idx="0">
+                          <a:schemeClr val="dk1"/>
+                        </a:effectRef>
+                        <a:fontRef idx="minor">
+                          <a:schemeClr val="tx1"/>
+                        </a:fontRef>
+                      </wps:style>
+                      <wps:bodyPr/>
+                    </wps:wsp>
+                  </a:graphicData>
+                </a:graphic>
+                <wp14:sizeRelH relativeFrom="margin">
+                  <wp14:pctWidth>0</wp14:pctWidth>
+                </wp14:sizeRelH>
+                <wp14:sizeRelV relativeFrom="margin">
+                  <wp14:pctHeight>0</wp14:pctHeight>
+                </wp14:sizeRelV>
+              </wp:anchor>
+            </w:drawing>
+          </mc:Choice>
+          <mc:Fallback>
+            <w:pict>
+              <v:shape w14:anchorId="59FAAA53" id="מחבר חץ ישר 23" o:spid="_x0000_s1026" type="#_x0000_t32" style="position:absolute;margin-left:118.45pt;margin-top:359.15pt;width:6.65pt;height:34.3pt;z-index:251703296;visibility:visible;mso-wrap-style:square;mso-width-percent:0;mso-height-percent:0;mso-wrap-distance-left:9pt;mso-wrap-distance-top:0;mso-wrap-distance-right:9pt;mso-wrap-distance-bottom:0;mso-position-horizontal:absolute;mso-position-horizontal-relative:margin;mso-position-vertical:absolute;mso-position-vertical-relative:text;mso-width-percent:0;mso-height-percent:0;mso-width-relative:margin;mso-height-relative:margin" o:gfxdata="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" strokecolor="black [3200]" strokeweight=".5pt">
+                <v:stroke endarrow="block" joinstyle="miter"/>
+                <w10:wrap type="tight" anchorx="margin"/>
+              </v:shape>
+            </w:pict>
+          </mc:Fallback>
+        </mc:AlternateContent>
+      </w:r>
       <w:r>
         <w:rPr>
           <w:rFonts w:hint="cs"/>
@@ -223,7 +939,16 @@
                                 <w:szCs w:val="20"/>
                                 <w:rtl/>
                               </w:rPr>
-                              <w:t>גישה לנתונים על כל המסעדות</w:t>
+                              <w:t xml:space="preserve">גישה לנתונים על כל </w:t>
+                            </w:r>
+                            <w:r>
+                              <w:rPr>
+                                <w:rFonts w:hint="cs"/>
+                                <w:sz w:val="20"/>
+                                <w:szCs w:val="20"/>
+                                <w:rtl/>
+                              </w:rPr>
+                              <w:t>המערכת</w:t>
                             </w:r>
                           </w:p>
                         </w:txbxContent>
@@ -248,7 +973,7 @@
           </mc:Choice>
           <mc:Fallback>
             <w:pict>
-              <v:roundrect w14:anchorId="3B71134D" id="מלבן: פינות מעוגלות 782026995" o:spid="_x0000_s1027" style="position:absolute;left:0;text-align:left;margin-left:272.7pt;margin-top:648.8pt;width:83.85pt;height:36.9pt;z-index:251742208;visibility:visible;mso-wrap-style:square;mso-width-percent:0;mso-height-percent:0;mso-wrap-distance-left:9pt;mso-wrap-distance-top:0;mso-wrap-distance-right:9pt;mso-wrap-distance-bottom:0;mso-position-horizontal:absolute;mso-position-horizontal-relative:text;mso-position-vertical:absolute;mso-position-vertical-relative:text;mso-width-percent:0;mso-height-percent:0;mso-width-relative:margin;mso-height-relative:margin;v-text-anchor:middle" arcsize="10923f" o:gfxdata="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" fillcolor="black [3200]" strokecolor="white [3201]" strokeweight="1.5pt">
+              <v:roundrect w14:anchorId="3B71134D" id="מלבן: פינות מעוגלות 782026995" o:spid="_x0000_s1030" style="position:absolute;left:0;text-align:left;margin-left:272.7pt;margin-top:648.8pt;width:83.85pt;height:36.9pt;z-index:251742208;visibility:visible;mso-wrap-style:square;mso-width-percent:0;mso-height-percent:0;mso-wrap-distance-left:9pt;mso-wrap-distance-top:0;mso-wrap-distance-right:9pt;mso-wrap-distance-bottom:0;mso-position-horizontal:absolute;mso-position-horizontal-relative:text;mso-position-vertical:absolute;mso-position-vertical-relative:text;mso-width-percent:0;mso-height-percent:0;mso-width-relative:margin;mso-height-relative:margin;v-text-anchor:middle" arcsize="10923f" o:gfxdata="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" fillcolor="black [3200]" strokecolor="white [3201]" strokeweight="1.5pt">
                 <v:stroke joinstyle="miter"/>
                 <v:textbox>
                   <w:txbxContent>
@@ -267,7 +992,16 @@
                           <w:szCs w:val="20"/>
                           <w:rtl/>
                         </w:rPr>
-                        <w:t>גישה לנתונים על כל המסעדות</w:t>
+                        <w:t xml:space="preserve">גישה לנתונים על כל </w:t>
+                      </w:r>
+                      <w:r>
+                        <w:rPr>
+                          <w:rFonts w:hint="cs"/>
+                          <w:sz w:val="20"/>
+                          <w:szCs w:val="20"/>
+                          <w:rtl/>
+                        </w:rPr>
+                        <w:t>המערכת</w:t>
                       </w:r>
                     </w:p>
                   </w:txbxContent>
@@ -485,7 +1219,7 @@
                                 <w:szCs w:val="20"/>
                                 <w:rtl/>
                               </w:rPr>
-                              <w:t>מסעדה כלשהי</w:t>
+                              <w:t xml:space="preserve">מסעדה </w:t>
                             </w:r>
                           </w:p>
                         </w:txbxContent>
@@ -510,7 +1244,7 @@
           </mc:Choice>
           <mc:Fallback>
             <w:pict>
-              <v:roundrect w14:anchorId="637E6D6C" id="מלבן: פינות מעוגלות 40" o:spid="_x0000_s1028" style="position:absolute;left:0;text-align:left;margin-left:380.8pt;margin-top:474.55pt;width:83.85pt;height:36.9pt;z-index:251716608;visibility:visible;mso-wrap-style:square;mso-width-percent:0;mso-height-percent:0;mso-wrap-distance-left:9pt;mso-wrap-distance-top:0;mso-wrap-distance-right:9pt;mso-wrap-distance-bottom:0;mso-position-horizontal:absolute;mso-position-horizontal-relative:text;mso-position-vertical:absolute;mso-position-vertical-relative:text;mso-width-percent:0;mso-height-percent:0;mso-width-relative:margin;mso-height-relative:margin;v-text-anchor:middle" arcsize="10923f" o:gfxdata="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" fillcolor="black [3200]" strokecolor="white [3201]" strokeweight="1.5pt">
+              <v:roundrect w14:anchorId="637E6D6C" id="מלבן: פינות מעוגלות 40" o:spid="_x0000_s1031" style="position:absolute;left:0;text-align:left;margin-left:380.8pt;margin-top:474.55pt;width:83.85pt;height:36.9pt;z-index:251716608;visibility:visible;mso-wrap-style:square;mso-width-percent:0;mso-height-percent:0;mso-wrap-distance-left:9pt;mso-wrap-distance-top:0;mso-wrap-distance-right:9pt;mso-wrap-distance-bottom:0;mso-position-horizontal:absolute;mso-position-horizontal-relative:text;mso-position-vertical:absolute;mso-position-vertical-relative:text;mso-width-percent:0;mso-height-percent:0;mso-width-relative:margin;mso-height-relative:margin;v-text-anchor:middle" arcsize="10923f" o:gfxdata="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" fillcolor="black [3200]" strokecolor="white [3201]" strokeweight="1.5pt">
                 <v:stroke joinstyle="miter"/>
                 <v:textbox>
                   <w:txbxContent>
@@ -556,7 +1290,7 @@
                           <w:szCs w:val="20"/>
                           <w:rtl/>
                         </w:rPr>
-                        <w:t>מסעדה כלשהי</w:t>
+                        <w:t xml:space="preserve">מסעדה </w:t>
                       </w:r>
                     </w:p>
                   </w:txbxContent>
@@ -674,7 +1408,7 @@
                                 <w:szCs w:val="20"/>
                                 <w:rtl/>
                               </w:rPr>
-                              <w:t>ראשי</w:t>
+                              <w:t>מערכת</w:t>
                             </w:r>
                           </w:p>
                         </w:txbxContent>
@@ -693,7 +1427,7 @@
           </mc:Choice>
           <mc:Fallback>
             <w:pict>
-              <v:roundrect w14:anchorId="542C1B83" id="מלבן: פינות מעוגלות 1338475122" o:spid="_x0000_s1029" style="position:absolute;left:0;text-align:left;margin-left:433.55pt;margin-top:552.75pt;width:64.5pt;height:40.5pt;z-index:251736064;visibility:visible;mso-wrap-style:square;mso-wrap-distance-left:9pt;mso-wrap-distance-top:0;mso-wrap-distance-right:9pt;mso-wrap-distance-bottom:0;mso-position-horizontal:absolute;mso-position-horizontal-relative:text;mso-position-vertical:absolute;mso-position-vertical-relative:text;v-text-anchor:middle" arcsize="10923f" o:gfxdata="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" fillcolor="black [3200]" strokecolor="white [3201]" strokeweight="1.5pt">
+              <v:roundrect w14:anchorId="542C1B83" id="מלבן: פינות מעוגלות 1338475122" o:spid="_x0000_s1032" style="position:absolute;left:0;text-align:left;margin-left:433.55pt;margin-top:552.75pt;width:64.5pt;height:40.5pt;z-index:251736064;visibility:visible;mso-wrap-style:square;mso-wrap-distance-left:9pt;mso-wrap-distance-top:0;mso-wrap-distance-right:9pt;mso-wrap-distance-bottom:0;mso-position-horizontal:absolute;mso-position-horizontal-relative:text;mso-position-vertical:absolute;mso-position-vertical-relative:text;v-text-anchor:middle" arcsize="10923f" o:gfxdata="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" fillcolor="black [3200]" strokecolor="white [3201]" strokeweight="1.5pt">
                 <v:stroke joinstyle="miter"/>
                 <v:textbox>
                   <w:txbxContent>
@@ -739,7 +1473,7 @@
                           <w:szCs w:val="20"/>
                           <w:rtl/>
                         </w:rPr>
-                        <w:t>ראשי</w:t>
+                        <w:t>מערכת</w:t>
                       </w:r>
                     </w:p>
                   </w:txbxContent>
@@ -1380,7 +2114,6 @@
                             <w:pPr>
                               <w:jc w:val="center"/>
                               <w:rPr>
-                                <w:rFonts w:hint="cs"/>
                                 <w:sz w:val="20"/>
                                 <w:szCs w:val="20"/>
                                 <w:rtl/>
@@ -1652,7 +2385,7 @@
         <mc:AlternateContent>
           <mc:Choice Requires="wps">
             <w:drawing>
-              <wp:anchor distT="0" distB="0" distL="114300" distR="114300" simplePos="0" relativeHeight="251678720" behindDoc="0" locked="0" layoutInCell="1" allowOverlap="1" wp14:anchorId="5F99FE75" wp14:editId="6894C3F1">
+              <wp:anchor distT="0" distB="0" distL="114300" distR="114300" simplePos="0" relativeHeight="251678720" behindDoc="0" locked="0" layoutInCell="1" allowOverlap="1" wp14:anchorId="5F99FE75" wp14:editId="281E7032">
                 <wp:simplePos x="0" y="0"/>
                 <wp:positionH relativeFrom="column">
                   <wp:posOffset>3625436</wp:posOffset>
@@ -1779,7 +2512,7 @@
           </mc:Choice>
           <mc:Fallback>
             <w:pict>
-              <v:roundrect w14:anchorId="5F99FE75" id="מלבן: פינות מעוגלות 10" o:spid="_x0000_s1031" style="position:absolute;left:0;text-align:left;margin-left:285.45pt;margin-top:315.95pt;width:99.5pt;height:58pt;z-index:251678720;visibility:visible;mso-wrap-style:square;mso-width-percent:0;mso-height-percent:0;mso-wrap-distance-left:9pt;mso-wrap-distance-top:0;mso-wrap-distance-right:9pt;mso-wrap-distance-bottom:0;mso-position-horizontal:absolute;mso-position-horizontal-relative:text;mso-position-vertical:absolute;mso-position-vertical-relative:text;mso-width-percent:0;mso-height-percent:0;mso-width-relative:margin;mso-height-relative:margin;v-text-anchor:middle" arcsize="10923f" o:gfxdata="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" fillcolor="#1f3763 [1604]" strokecolor="#375623 [1609]" strokeweight="1pt">
+              <v:roundrect w14:anchorId="5F99FE75" id="מלבן: פינות מעוגלות 10" o:spid="_x0000_s1034" style="position:absolute;left:0;text-align:left;margin-left:285.45pt;margin-top:315.95pt;width:99.5pt;height:58pt;z-index:251678720;visibility:visible;mso-wrap-style:square;mso-width-percent:0;mso-height-percent:0;mso-wrap-distance-left:9pt;mso-wrap-distance-top:0;mso-wrap-distance-right:9pt;mso-wrap-distance-bottom:0;mso-position-horizontal:absolute;mso-position-horizontal-relative:text;mso-position-vertical:absolute;mso-position-vertical-relative:text;mso-width-percent:0;mso-height-percent:0;mso-width-relative:margin;mso-height-relative:margin;v-text-anchor:middle" arcsize="10923f" o:gfxdata="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" fillcolor="#1f3763 [1604]" strokecolor="#375623 [1609]" strokeweight="1pt">
                 <v:stroke joinstyle="miter"/>
                 <v:textbox>
                   <w:txbxContent>
@@ -1850,97 +2583,7 @@
         <mc:AlternateContent>
           <mc:Choice Requires="wps">
             <w:drawing>
-              <wp:anchor distT="0" distB="0" distL="114300" distR="114300" simplePos="0" relativeHeight="251711488" behindDoc="0" locked="0" layoutInCell="1" allowOverlap="1" wp14:anchorId="727D8BF8" wp14:editId="7ACDC828">
-                <wp:simplePos x="0" y="0"/>
-                <wp:positionH relativeFrom="column">
-                  <wp:posOffset>4213860</wp:posOffset>
-                </wp:positionH>
-                <wp:positionV relativeFrom="paragraph">
-                  <wp:posOffset>4857750</wp:posOffset>
-                </wp:positionV>
-                <wp:extent cx="45085" cy="667385"/>
-                <wp:effectExtent l="38100" t="0" r="69215" b="56515"/>
-                <wp:wrapTight wrapText="bothSides">
-                  <wp:wrapPolygon edited="0">
-                    <wp:start x="-18254" y="0"/>
-                    <wp:lineTo x="-18254" y="19730"/>
-                    <wp:lineTo x="0" y="22813"/>
-                    <wp:lineTo x="45634" y="22813"/>
-                    <wp:lineTo x="27380" y="0"/>
-                    <wp:lineTo x="-18254" y="0"/>
-                  </wp:wrapPolygon>
-                </wp:wrapTight>
-                <wp:docPr id="30" name="מחבר חץ ישר 30"/>
-                <wp:cNvGraphicFramePr/>
-                <a:graphic xmlns:a="http://schemas.openxmlformats.org/drawingml/2006/main">
-                  <a:graphicData uri="http://schemas.microsoft.com/office/word/2010/wordprocessingShape">
-                    <wps:wsp>
-                      <wps:cNvCnPr/>
-                      <wps:spPr>
-                        <a:xfrm>
-                          <a:off x="0" y="0"/>
-                          <a:ext cx="45085" cy="667385"/>
-                        </a:xfrm>
-                        <a:prstGeom prst="straightConnector1">
-                          <a:avLst/>
-                        </a:prstGeom>
-                        <a:ln>
-                          <a:tailEnd type="triangle"/>
-                        </a:ln>
-                      </wps:spPr>
-                      <wps:style>
-                        <a:lnRef idx="1">
-                          <a:schemeClr val="dk1"/>
-                        </a:lnRef>
-                        <a:fillRef idx="0">
-                          <a:schemeClr val="dk1"/>
-                        </a:fillRef>
-                        <a:effectRef idx="0">
-                          <a:schemeClr val="dk1"/>
-                        </a:effectRef>
-                        <a:fontRef idx="minor">
-                          <a:schemeClr val="tx1"/>
-                        </a:fontRef>
-                      </wps:style>
-                      <wps:bodyPr/>
-                    </wps:wsp>
-                  </a:graphicData>
-                </a:graphic>
-                <wp14:sizeRelH relativeFrom="margin">
-                  <wp14:pctWidth>0</wp14:pctWidth>
-                </wp14:sizeRelH>
-                <wp14:sizeRelV relativeFrom="margin">
-                  <wp14:pctHeight>0</wp14:pctHeight>
-                </wp14:sizeRelV>
-              </wp:anchor>
-            </w:drawing>
-          </mc:Choice>
-          <mc:Fallback>
-            <w:pict>
-              <v:shape w14:anchorId="1E39E756" id="מחבר חץ ישר 30" o:spid="_x0000_s1026" type="#_x0000_t32" style="position:absolute;margin-left:331.8pt;margin-top:382.5pt;width:3.55pt;height:52.55pt;z-index:251711488;visibility:visible;mso-wrap-style:square;mso-width-percent:0;mso-height-percent:0;mso-wrap-distance-left:9pt;mso-wrap-distance-top:0;mso-wrap-distance-right:9pt;mso-wrap-distance-bottom:0;mso-position-horizontal:absolute;mso-position-horizontal-relative:text;mso-position-vertical:absolute;mso-position-vertical-relative:text;mso-width-percent:0;mso-height-percent:0;mso-width-relative:margin;mso-height-relative:margin" o:gfxdata="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" strokecolor="black [3200]" strokeweight=".5pt">
-                <v:stroke endarrow="block" joinstyle="miter"/>
-                <w10:wrap type="tight"/>
-              </v:shape>
-            </w:pict>
-          </mc:Fallback>
-        </mc:AlternateContent>
-      </w:r>
-      <w:r>
-        <w:rPr>
-          <w:rFonts w:hint="cs"/>
-          <w:b/>
-          <w:bCs/>
-          <w:noProof/>
-          <w:sz w:val="44"/>
-          <w:szCs w:val="44"/>
-          <w:u w:val="single"/>
-          <w:rtl/>
-          <w:lang w:val="he-IL"/>
-        </w:rPr>
-        <mc:AlternateContent>
-          <mc:Choice Requires="wps">
-            <w:drawing>
-              <wp:anchor distT="0" distB="0" distL="114300" distR="114300" simplePos="0" relativeHeight="251691008" behindDoc="0" locked="0" layoutInCell="1" allowOverlap="1" wp14:anchorId="148229A5" wp14:editId="30824F12">
+              <wp:anchor distT="0" distB="0" distL="114300" distR="114300" simplePos="0" relativeHeight="251691008" behindDoc="0" locked="0" layoutInCell="1" allowOverlap="1" wp14:anchorId="148229A5" wp14:editId="4EFB83B9">
                 <wp:simplePos x="0" y="0"/>
                 <wp:positionH relativeFrom="column">
                   <wp:posOffset>613355</wp:posOffset>
@@ -2038,7 +2681,7 @@
           </mc:Choice>
           <mc:Fallback>
             <w:pict>
-              <v:roundrect w14:anchorId="148229A5" id="מלבן: פינות מעוגלות 16" o:spid="_x0000_s1032" style="position:absolute;left:0;text-align:left;margin-left:48.3pt;margin-top:311pt;width:90.85pt;height:40.2pt;z-index:251691008;visibility:visible;mso-wrap-style:square;mso-width-percent:0;mso-height-percent:0;mso-wrap-distance-left:9pt;mso-wrap-distance-top:0;mso-wrap-distance-right:9pt;mso-wrap-distance-bottom:0;mso-position-horizontal:absolute;mso-position-horizontal-relative:text;mso-position-vertical:absolute;mso-position-vertical-relative:text;mso-width-percent:0;mso-height-percent:0;mso-width-relative:margin;mso-height-relative:margin;v-text-anchor:middle" arcsize="10923f" o:gfxdata="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" fillcolor="#1f3763 [1604]" strokecolor="#375623 [1609]" strokeweight="1pt">
+              <v:roundrect w14:anchorId="148229A5" id="מלבן: פינות מעוגלות 16" o:spid="_x0000_s1035" style="position:absolute;left:0;text-align:left;margin-left:48.3pt;margin-top:311pt;width:90.85pt;height:40.2pt;z-index:251691008;visibility:visible;mso-wrap-style:square;mso-width-percent:0;mso-height-percent:0;mso-wrap-distance-left:9pt;mso-wrap-distance-top:0;mso-wrap-distance-right:9pt;mso-wrap-distance-bottom:0;mso-position-horizontal:absolute;mso-position-horizontal-relative:text;mso-position-vertical:absolute;mso-position-vertical-relative:text;mso-width-percent:0;mso-height-percent:0;mso-width-relative:margin;mso-height-relative:margin;v-text-anchor:middle" arcsize="10923f" o:gfxdata="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" fillcolor="#1f3763 [1604]" strokecolor="#375623 [1609]" strokeweight="1pt">
                 <v:stroke joinstyle="miter"/>
                 <v:textbox>
                   <w:txbxContent>
@@ -2064,859 +2707,6 @@
                   </w:txbxContent>
                 </v:textbox>
                 <w10:wrap type="tight"/>
-              </v:roundrect>
-            </w:pict>
-          </mc:Fallback>
-        </mc:AlternateContent>
-      </w:r>
-      <w:r>
-        <w:rPr>
-          <w:rFonts w:hint="cs"/>
-          <w:b/>
-          <w:bCs/>
-          <w:noProof/>
-          <w:sz w:val="44"/>
-          <w:szCs w:val="44"/>
-          <w:u w:val="single"/>
-          <w:rtl/>
-          <w:lang w:val="he-IL"/>
-        </w:rPr>
-        <mc:AlternateContent>
-          <mc:Choice Requires="wps">
-            <w:drawing>
-              <wp:anchor distT="0" distB="0" distL="114300" distR="114300" simplePos="0" relativeHeight="251693056" behindDoc="0" locked="0" layoutInCell="1" allowOverlap="1" wp14:anchorId="58DAED1C" wp14:editId="7B2FE163">
-                <wp:simplePos x="0" y="0"/>
-                <wp:positionH relativeFrom="margin">
-                  <wp:posOffset>-245497</wp:posOffset>
-                </wp:positionH>
-                <wp:positionV relativeFrom="paragraph">
-                  <wp:posOffset>4518660</wp:posOffset>
-                </wp:positionV>
-                <wp:extent cx="678180" cy="502920"/>
-                <wp:effectExtent l="38100" t="0" r="26670" b="49530"/>
-                <wp:wrapTight wrapText="bothSides">
-                  <wp:wrapPolygon edited="0">
-                    <wp:start x="20022" y="0"/>
-                    <wp:lineTo x="6674" y="0"/>
-                    <wp:lineTo x="6674" y="13091"/>
-                    <wp:lineTo x="-1213" y="13091"/>
-                    <wp:lineTo x="-1213" y="22909"/>
-                    <wp:lineTo x="3640" y="22909"/>
-                    <wp:lineTo x="4247" y="21273"/>
-                    <wp:lineTo x="11528" y="13091"/>
-                    <wp:lineTo x="21843" y="818"/>
-                    <wp:lineTo x="21843" y="0"/>
-                    <wp:lineTo x="20022" y="0"/>
-                  </wp:wrapPolygon>
-                </wp:wrapTight>
-                <wp:docPr id="17" name="מחבר חץ ישר 17"/>
-                <wp:cNvGraphicFramePr/>
-                <a:graphic xmlns:a="http://schemas.openxmlformats.org/drawingml/2006/main">
-                  <a:graphicData uri="http://schemas.microsoft.com/office/word/2010/wordprocessingShape">
-                    <wps:wsp>
-                      <wps:cNvCnPr/>
-                      <wps:spPr>
-                        <a:xfrm flipH="1">
-                          <a:off x="0" y="0"/>
-                          <a:ext cx="678180" cy="502920"/>
-                        </a:xfrm>
-                        <a:prstGeom prst="straightConnector1">
-                          <a:avLst/>
-                        </a:prstGeom>
-                        <a:ln>
-                          <a:tailEnd type="triangle"/>
-                        </a:ln>
-                      </wps:spPr>
-                      <wps:style>
-                        <a:lnRef idx="1">
-                          <a:schemeClr val="dk1"/>
-                        </a:lnRef>
-                        <a:fillRef idx="0">
-                          <a:schemeClr val="dk1"/>
-                        </a:fillRef>
-                        <a:effectRef idx="0">
-                          <a:schemeClr val="dk1"/>
-                        </a:effectRef>
-                        <a:fontRef idx="minor">
-                          <a:schemeClr val="tx1"/>
-                        </a:fontRef>
-                      </wps:style>
-                      <wps:bodyPr/>
-                    </wps:wsp>
-                  </a:graphicData>
-                </a:graphic>
-                <wp14:sizeRelH relativeFrom="margin">
-                  <wp14:pctWidth>0</wp14:pctWidth>
-                </wp14:sizeRelH>
-                <wp14:sizeRelV relativeFrom="margin">
-                  <wp14:pctHeight>0</wp14:pctHeight>
-                </wp14:sizeRelV>
-              </wp:anchor>
-            </w:drawing>
-          </mc:Choice>
-          <mc:Fallback>
-            <w:pict>
-              <v:shape w14:anchorId="6950E66D" id="מחבר חץ ישר 17" o:spid="_x0000_s1026" type="#_x0000_t32" style="position:absolute;margin-left:-19.35pt;margin-top:355.8pt;width:53.4pt;height:39.6pt;flip:x;z-index:251693056;visibility:visible;mso-wrap-style:square;mso-width-percent:0;mso-height-percent:0;mso-wrap-distance-left:9pt;mso-wrap-distance-top:0;mso-wrap-distance-right:9pt;mso-wrap-distance-bottom:0;mso-position-horizontal:absolute;mso-position-horizontal-relative:margin;mso-position-vertical:absolute;mso-position-vertical-relative:text;mso-width-percent:0;mso-height-percent:0;mso-width-relative:margin;mso-height-relative:margin" o:gfxdata="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" strokecolor="black [3200]" strokeweight=".5pt">
-                <v:stroke endarrow="block" joinstyle="miter"/>
-                <w10:wrap type="tight" anchorx="margin"/>
-              </v:shape>
-            </w:pict>
-          </mc:Fallback>
-        </mc:AlternateContent>
-      </w:r>
-      <w:r>
-        <w:rPr>
-          <w:rFonts w:hint="cs"/>
-          <w:b/>
-          <w:bCs/>
-          <w:noProof/>
-          <w:sz w:val="44"/>
-          <w:szCs w:val="44"/>
-          <w:u w:val="single"/>
-          <w:rtl/>
-          <w:lang w:val="he-IL"/>
-        </w:rPr>
-        <mc:AlternateContent>
-          <mc:Choice Requires="wps">
-            <w:drawing>
-              <wp:anchor distT="0" distB="0" distL="114300" distR="114300" simplePos="0" relativeHeight="251703296" behindDoc="0" locked="0" layoutInCell="1" allowOverlap="1" wp14:anchorId="5069027B" wp14:editId="7318C342">
-                <wp:simplePos x="0" y="0"/>
-                <wp:positionH relativeFrom="margin">
-                  <wp:posOffset>1962508</wp:posOffset>
-                </wp:positionH>
-                <wp:positionV relativeFrom="paragraph">
-                  <wp:posOffset>4519654</wp:posOffset>
-                </wp:positionV>
-                <wp:extent cx="708660" cy="548640"/>
-                <wp:effectExtent l="0" t="0" r="72390" b="60960"/>
-                <wp:wrapTight wrapText="bothSides">
-                  <wp:wrapPolygon edited="0">
-                    <wp:start x="0" y="0"/>
-                    <wp:lineTo x="0" y="1500"/>
-                    <wp:lineTo x="19742" y="23250"/>
-                    <wp:lineTo x="22645" y="23250"/>
-                    <wp:lineTo x="23226" y="21000"/>
-                    <wp:lineTo x="20903" y="18000"/>
-                    <wp:lineTo x="1742" y="0"/>
-                    <wp:lineTo x="0" y="0"/>
-                  </wp:wrapPolygon>
-                </wp:wrapTight>
-                <wp:docPr id="23" name="מחבר חץ ישר 23"/>
-                <wp:cNvGraphicFramePr/>
-                <a:graphic xmlns:a="http://schemas.openxmlformats.org/drawingml/2006/main">
-                  <a:graphicData uri="http://schemas.microsoft.com/office/word/2010/wordprocessingShape">
-                    <wps:wsp>
-                      <wps:cNvCnPr/>
-                      <wps:spPr>
-                        <a:xfrm>
-                          <a:off x="0" y="0"/>
-                          <a:ext cx="708660" cy="548640"/>
-                        </a:xfrm>
-                        <a:prstGeom prst="straightConnector1">
-                          <a:avLst/>
-                        </a:prstGeom>
-                        <a:ln>
-                          <a:tailEnd type="triangle"/>
-                        </a:ln>
-                      </wps:spPr>
-                      <wps:style>
-                        <a:lnRef idx="1">
-                          <a:schemeClr val="dk1"/>
-                        </a:lnRef>
-                        <a:fillRef idx="0">
-                          <a:schemeClr val="dk1"/>
-                        </a:fillRef>
-                        <a:effectRef idx="0">
-                          <a:schemeClr val="dk1"/>
-                        </a:effectRef>
-                        <a:fontRef idx="minor">
-                          <a:schemeClr val="tx1"/>
-                        </a:fontRef>
-                      </wps:style>
-                      <wps:bodyPr/>
-                    </wps:wsp>
-                  </a:graphicData>
-                </a:graphic>
-                <wp14:sizeRelH relativeFrom="margin">
-                  <wp14:pctWidth>0</wp14:pctWidth>
-                </wp14:sizeRelH>
-                <wp14:sizeRelV relativeFrom="margin">
-                  <wp14:pctHeight>0</wp14:pctHeight>
-                </wp14:sizeRelV>
-              </wp:anchor>
-            </w:drawing>
-          </mc:Choice>
-          <mc:Fallback>
-            <w:pict>
-              <v:shape w14:anchorId="73281167" id="מחבר חץ ישר 23" o:spid="_x0000_s1026" type="#_x0000_t32" style="position:absolute;margin-left:154.55pt;margin-top:355.9pt;width:55.8pt;height:43.2pt;z-index:251703296;visibility:visible;mso-wrap-style:square;mso-width-percent:0;mso-height-percent:0;mso-wrap-distance-left:9pt;mso-wrap-distance-top:0;mso-wrap-distance-right:9pt;mso-wrap-distance-bottom:0;mso-position-horizontal:absolute;mso-position-horizontal-relative:margin;mso-position-vertical:absolute;mso-position-vertical-relative:text;mso-width-percent:0;mso-height-percent:0;mso-width-relative:margin;mso-height-relative:margin" o:gfxdata="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" strokecolor="black [3200]" strokeweight=".5pt">
-                <v:stroke endarrow="block" joinstyle="miter"/>
-                <w10:wrap type="tight" anchorx="margin"/>
-              </v:shape>
-            </w:pict>
-          </mc:Fallback>
-        </mc:AlternateContent>
-      </w:r>
-      <w:r>
-        <w:rPr>
-          <w:rFonts w:hint="cs"/>
-          <w:b/>
-          <w:bCs/>
-          <w:noProof/>
-          <w:sz w:val="44"/>
-          <w:szCs w:val="44"/>
-          <w:u w:val="single"/>
-          <w:rtl/>
-          <w:lang w:val="he-IL"/>
-        </w:rPr>
-        <mc:AlternateContent>
-          <mc:Choice Requires="wps">
-            <w:drawing>
-              <wp:anchor distT="0" distB="0" distL="114300" distR="114300" simplePos="0" relativeHeight="251697152" behindDoc="0" locked="0" layoutInCell="1" allowOverlap="1" wp14:anchorId="3965518A" wp14:editId="7766CCF1">
-                <wp:simplePos x="0" y="0"/>
-                <wp:positionH relativeFrom="margin">
-                  <wp:posOffset>1191371</wp:posOffset>
-                </wp:positionH>
-                <wp:positionV relativeFrom="paragraph">
-                  <wp:posOffset>4511372</wp:posOffset>
-                </wp:positionV>
-                <wp:extent cx="45085" cy="571500"/>
-                <wp:effectExtent l="38100" t="0" r="50165" b="57150"/>
-                <wp:wrapTight wrapText="bothSides">
-                  <wp:wrapPolygon edited="0">
-                    <wp:start x="0" y="0"/>
-                    <wp:lineTo x="-18254" y="23040"/>
-                    <wp:lineTo x="18254" y="23040"/>
-                    <wp:lineTo x="36507" y="11520"/>
-                    <wp:lineTo x="36507" y="0"/>
-                    <wp:lineTo x="0" y="0"/>
-                  </wp:wrapPolygon>
-                </wp:wrapTight>
-                <wp:docPr id="20" name="מחבר חץ ישר 20"/>
-                <wp:cNvGraphicFramePr/>
-                <a:graphic xmlns:a="http://schemas.openxmlformats.org/drawingml/2006/main">
-                  <a:graphicData uri="http://schemas.microsoft.com/office/word/2010/wordprocessingShape">
-                    <wps:wsp>
-                      <wps:cNvCnPr/>
-                      <wps:spPr>
-                        <a:xfrm flipH="1">
-                          <a:off x="0" y="0"/>
-                          <a:ext cx="45085" cy="571500"/>
-                        </a:xfrm>
-                        <a:prstGeom prst="straightConnector1">
-                          <a:avLst/>
-                        </a:prstGeom>
-                        <a:ln>
-                          <a:tailEnd type="triangle"/>
-                        </a:ln>
-                      </wps:spPr>
-                      <wps:style>
-                        <a:lnRef idx="1">
-                          <a:schemeClr val="dk1"/>
-                        </a:lnRef>
-                        <a:fillRef idx="0">
-                          <a:schemeClr val="dk1"/>
-                        </a:fillRef>
-                        <a:effectRef idx="0">
-                          <a:schemeClr val="dk1"/>
-                        </a:effectRef>
-                        <a:fontRef idx="minor">
-                          <a:schemeClr val="tx1"/>
-                        </a:fontRef>
-                      </wps:style>
-                      <wps:bodyPr/>
-                    </wps:wsp>
-                  </a:graphicData>
-                </a:graphic>
-                <wp14:sizeRelH relativeFrom="margin">
-                  <wp14:pctWidth>0</wp14:pctWidth>
-                </wp14:sizeRelH>
-                <wp14:sizeRelV relativeFrom="margin">
-                  <wp14:pctHeight>0</wp14:pctHeight>
-                </wp14:sizeRelV>
-              </wp:anchor>
-            </w:drawing>
-          </mc:Choice>
-          <mc:Fallback>
-            <w:pict>
-              <v:shape w14:anchorId="2AABB71B" id="מחבר חץ ישר 20" o:spid="_x0000_s1026" type="#_x0000_t32" style="position:absolute;margin-left:93.8pt;margin-top:355.25pt;width:3.55pt;height:45pt;flip:x;z-index:251697152;visibility:visible;mso-wrap-style:square;mso-width-percent:0;mso-height-percent:0;mso-wrap-distance-left:9pt;mso-wrap-distance-top:0;mso-wrap-distance-right:9pt;mso-wrap-distance-bottom:0;mso-position-horizontal:absolute;mso-position-horizontal-relative:margin;mso-position-vertical:absolute;mso-position-vertical-relative:text;mso-width-percent:0;mso-height-percent:0;mso-width-relative:margin;mso-height-relative:margin" o:gfxdata="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" strokecolor="black [3200]" strokeweight=".5pt">
-                <v:stroke endarrow="block" joinstyle="miter"/>
-                <w10:wrap type="tight" anchorx="margin"/>
-              </v:shape>
-            </w:pict>
-          </mc:Fallback>
-        </mc:AlternateContent>
-      </w:r>
-      <w:r>
-        <w:rPr>
-          <w:rFonts w:hint="cs"/>
-          <w:b/>
-          <w:bCs/>
-          <w:noProof/>
-          <w:sz w:val="44"/>
-          <w:szCs w:val="44"/>
-          <w:u w:val="single"/>
-          <w:rtl/>
-          <w:lang w:val="he-IL"/>
-        </w:rPr>
-        <mc:AlternateContent>
-          <mc:Choice Requires="wps">
-            <w:drawing>
-              <wp:anchor distT="0" distB="0" distL="114300" distR="114300" simplePos="0" relativeHeight="251705344" behindDoc="0" locked="0" layoutInCell="1" allowOverlap="1" wp14:anchorId="7CB211FB" wp14:editId="483FF3E3">
-                <wp:simplePos x="0" y="0"/>
-                <wp:positionH relativeFrom="margin">
-                  <wp:align>center</wp:align>
-                </wp:positionH>
-                <wp:positionV relativeFrom="paragraph">
-                  <wp:posOffset>5199297</wp:posOffset>
-                </wp:positionV>
-                <wp:extent cx="1153795" cy="510540"/>
-                <wp:effectExtent l="0" t="0" r="27305" b="22860"/>
-                <wp:wrapTight wrapText="bothSides">
-                  <wp:wrapPolygon edited="0">
-                    <wp:start x="0" y="0"/>
-                    <wp:lineTo x="0" y="21761"/>
-                    <wp:lineTo x="21755" y="21761"/>
-                    <wp:lineTo x="21755" y="0"/>
-                    <wp:lineTo x="0" y="0"/>
-                  </wp:wrapPolygon>
-                </wp:wrapTight>
-                <wp:docPr id="24" name="מלבן: פינות מעוגלות 24"/>
-                <wp:cNvGraphicFramePr/>
-                <a:graphic xmlns:a="http://schemas.openxmlformats.org/drawingml/2006/main">
-                  <a:graphicData uri="http://schemas.microsoft.com/office/word/2010/wordprocessingShape">
-                    <wps:wsp>
-                      <wps:cNvSpPr/>
-                      <wps:spPr>
-                        <a:xfrm>
-                          <a:off x="0" y="0"/>
-                          <a:ext cx="1153795" cy="510540"/>
-                        </a:xfrm>
-                        <a:prstGeom prst="roundRect">
-                          <a:avLst/>
-                        </a:prstGeom>
-                        <a:solidFill>
-                          <a:schemeClr val="accent1">
-                            <a:lumMod val="50000"/>
-                          </a:schemeClr>
-                        </a:solidFill>
-                      </wps:spPr>
-                      <wps:style>
-                        <a:lnRef idx="2">
-                          <a:schemeClr val="accent6">
-                            <a:shade val="50000"/>
-                          </a:schemeClr>
-                        </a:lnRef>
-                        <a:fillRef idx="1">
-                          <a:schemeClr val="accent6"/>
-                        </a:fillRef>
-                        <a:effectRef idx="0">
-                          <a:schemeClr val="accent6"/>
-                        </a:effectRef>
-                        <a:fontRef idx="minor">
-                          <a:schemeClr val="lt1"/>
-                        </a:fontRef>
-                      </wps:style>
-                      <wps:txbx>
-                        <w:txbxContent>
-                          <w:p>
-                            <w:pPr>
-                              <w:jc w:val="center"/>
-                              <w:rPr>
-                                <w:sz w:val="20"/>
-                                <w:szCs w:val="20"/>
-                                <w:rtl/>
-                              </w:rPr>
-                            </w:pPr>
-                            <w:r>
-                              <w:rPr>
-                                <w:rFonts w:hint="cs"/>
-                                <w:sz w:val="20"/>
-                                <w:szCs w:val="20"/>
-                                <w:rtl/>
-                              </w:rPr>
-                              <w:t>עריכת הזמנה קיימת</w:t>
-                            </w:r>
-                          </w:p>
-                        </w:txbxContent>
-                      </wps:txbx>
-                      <wps:bodyPr rot="0" spcFirstLastPara="0" vertOverflow="overflow" horzOverflow="overflow" vert="horz" wrap="square" lIns="91440" tIns="45720" rIns="91440" bIns="45720" numCol="1" spcCol="0" rtlCol="1" fromWordArt="0" anchor="ctr" anchorCtr="0" forceAA="0" compatLnSpc="1">
-                        <a:prstTxWarp prst="textNoShape">
-                          <a:avLst/>
-                        </a:prstTxWarp>
-                        <a:noAutofit/>
-                      </wps:bodyPr>
-                    </wps:wsp>
-                  </a:graphicData>
-                </a:graphic>
-                <wp14:sizeRelH relativeFrom="margin">
-                  <wp14:pctWidth>0</wp14:pctWidth>
-                </wp14:sizeRelH>
-                <wp14:sizeRelV relativeFrom="margin">
-                  <wp14:pctHeight>0</wp14:pctHeight>
-                </wp14:sizeRelV>
-              </wp:anchor>
-            </w:drawing>
-          </mc:Choice>
-          <mc:Fallback>
-            <w:pict>
-              <v:roundrect w14:anchorId="7CB211FB" id="מלבן: פינות מעוגלות 24" o:spid="_x0000_s1033" style="position:absolute;left:0;text-align:left;margin-left:0;margin-top:409.4pt;width:90.85pt;height:40.2pt;z-index:251705344;visibility:visible;mso-wrap-style:square;mso-width-percent:0;mso-height-percent:0;mso-wrap-distance-left:9pt;mso-wrap-distance-top:0;mso-wrap-distance-right:9pt;mso-wrap-distance-bottom:0;mso-position-horizontal:center;mso-position-horizontal-relative:margin;mso-position-vertical:absolute;mso-position-vertical-relative:text;mso-width-percent:0;mso-height-percent:0;mso-width-relative:margin;mso-height-relative:margin;v-text-anchor:middle" arcsize="10923f" o:gfxdata="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" fillcolor="#1f3763 [1604]" strokecolor="#375623 [1609]" strokeweight="1pt">
-                <v:stroke joinstyle="miter"/>
-                <v:textbox>
-                  <w:txbxContent>
-                    <w:p>
-                      <w:pPr>
-                        <w:jc w:val="center"/>
-                        <w:rPr>
-                          <w:sz w:val="20"/>
-                          <w:szCs w:val="20"/>
-                          <w:rtl/>
-                        </w:rPr>
-                      </w:pPr>
-                      <w:r>
-                        <w:rPr>
-                          <w:rFonts w:hint="cs"/>
-                          <w:sz w:val="20"/>
-                          <w:szCs w:val="20"/>
-                          <w:rtl/>
-                        </w:rPr>
-                        <w:t>עריכת הזמנה קיימת</w:t>
-                      </w:r>
-                    </w:p>
-                  </w:txbxContent>
-                </v:textbox>
-                <w10:wrap type="tight" anchorx="margin"/>
-              </v:roundrect>
-            </w:pict>
-          </mc:Fallback>
-        </mc:AlternateContent>
-      </w:r>
-      <w:r>
-        <w:rPr>
-          <w:rFonts w:hint="cs"/>
-          <w:b/>
-          <w:bCs/>
-          <w:noProof/>
-          <w:sz w:val="44"/>
-          <w:szCs w:val="44"/>
-          <w:u w:val="single"/>
-          <w:rtl/>
-          <w:lang w:val="he-IL"/>
-        </w:rPr>
-        <mc:AlternateContent>
-          <mc:Choice Requires="wps">
-            <w:drawing>
-              <wp:anchor distT="0" distB="0" distL="114300" distR="114300" simplePos="0" relativeHeight="251699200" behindDoc="0" locked="0" layoutInCell="1" allowOverlap="1" wp14:anchorId="1405BDF4" wp14:editId="4DABDE51">
-                <wp:simplePos x="0" y="0"/>
-                <wp:positionH relativeFrom="margin">
-                  <wp:posOffset>651648</wp:posOffset>
-                </wp:positionH>
-                <wp:positionV relativeFrom="paragraph">
-                  <wp:posOffset>5193720</wp:posOffset>
-                </wp:positionV>
-                <wp:extent cx="1153795" cy="510540"/>
-                <wp:effectExtent l="0" t="0" r="27305" b="22860"/>
-                <wp:wrapTight wrapText="bothSides">
-                  <wp:wrapPolygon edited="0">
-                    <wp:start x="0" y="0"/>
-                    <wp:lineTo x="0" y="21761"/>
-                    <wp:lineTo x="21755" y="21761"/>
-                    <wp:lineTo x="21755" y="0"/>
-                    <wp:lineTo x="0" y="0"/>
-                  </wp:wrapPolygon>
-                </wp:wrapTight>
-                <wp:docPr id="21" name="מלבן: פינות מעוגלות 21"/>
-                <wp:cNvGraphicFramePr/>
-                <a:graphic xmlns:a="http://schemas.openxmlformats.org/drawingml/2006/main">
-                  <a:graphicData uri="http://schemas.microsoft.com/office/word/2010/wordprocessingShape">
-                    <wps:wsp>
-                      <wps:cNvSpPr/>
-                      <wps:spPr>
-                        <a:xfrm>
-                          <a:off x="0" y="0"/>
-                          <a:ext cx="1153795" cy="510540"/>
-                        </a:xfrm>
-                        <a:prstGeom prst="roundRect">
-                          <a:avLst/>
-                        </a:prstGeom>
-                        <a:solidFill>
-                          <a:schemeClr val="accent1">
-                            <a:lumMod val="50000"/>
-                          </a:schemeClr>
-                        </a:solidFill>
-                      </wps:spPr>
-                      <wps:style>
-                        <a:lnRef idx="2">
-                          <a:schemeClr val="accent6">
-                            <a:shade val="50000"/>
-                          </a:schemeClr>
-                        </a:lnRef>
-                        <a:fillRef idx="1">
-                          <a:schemeClr val="accent6"/>
-                        </a:fillRef>
-                        <a:effectRef idx="0">
-                          <a:schemeClr val="accent6"/>
-                        </a:effectRef>
-                        <a:fontRef idx="minor">
-                          <a:schemeClr val="lt1"/>
-                        </a:fontRef>
-                      </wps:style>
-                      <wps:txbx>
-                        <w:txbxContent>
-                          <w:p>
-                            <w:pPr>
-                              <w:jc w:val="center"/>
-                              <w:rPr>
-                                <w:sz w:val="20"/>
-                                <w:szCs w:val="20"/>
-                                <w:rtl/>
-                              </w:rPr>
-                            </w:pPr>
-                            <w:r>
-                              <w:rPr>
-                                <w:rFonts w:hint="cs"/>
-                                <w:sz w:val="20"/>
-                                <w:szCs w:val="20"/>
-                                <w:rtl/>
-                              </w:rPr>
-                              <w:t>מסעדות מועדפות</w:t>
-                            </w:r>
-                          </w:p>
-                        </w:txbxContent>
-                      </wps:txbx>
-                      <wps:bodyPr rot="0" spcFirstLastPara="0" vertOverflow="overflow" horzOverflow="overflow" vert="horz" wrap="square" lIns="91440" tIns="45720" rIns="91440" bIns="45720" numCol="1" spcCol="0" rtlCol="1" fromWordArt="0" anchor="ctr" anchorCtr="0" forceAA="0" compatLnSpc="1">
-                        <a:prstTxWarp prst="textNoShape">
-                          <a:avLst/>
-                        </a:prstTxWarp>
-                        <a:noAutofit/>
-                      </wps:bodyPr>
-                    </wps:wsp>
-                  </a:graphicData>
-                </a:graphic>
-                <wp14:sizeRelH relativeFrom="margin">
-                  <wp14:pctWidth>0</wp14:pctWidth>
-                </wp14:sizeRelH>
-                <wp14:sizeRelV relativeFrom="margin">
-                  <wp14:pctHeight>0</wp14:pctHeight>
-                </wp14:sizeRelV>
-              </wp:anchor>
-            </w:drawing>
-          </mc:Choice>
-          <mc:Fallback>
-            <w:pict>
-              <v:roundrect w14:anchorId="1405BDF4" id="מלבן: פינות מעוגלות 21" o:spid="_x0000_s1034" style="position:absolute;left:0;text-align:left;margin-left:51.3pt;margin-top:408.95pt;width:90.85pt;height:40.2pt;z-index:251699200;visibility:visible;mso-wrap-style:square;mso-width-percent:0;mso-height-percent:0;mso-wrap-distance-left:9pt;mso-wrap-distance-top:0;mso-wrap-distance-right:9pt;mso-wrap-distance-bottom:0;mso-position-horizontal:absolute;mso-position-horizontal-relative:margin;mso-position-vertical:absolute;mso-position-vertical-relative:text;mso-width-percent:0;mso-height-percent:0;mso-width-relative:margin;mso-height-relative:margin;v-text-anchor:middle" arcsize="10923f" o:gfxdata="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" fillcolor="#1f3763 [1604]" strokecolor="#375623 [1609]" strokeweight="1pt">
-                <v:stroke joinstyle="miter"/>
-                <v:textbox>
-                  <w:txbxContent>
-                    <w:p>
-                      <w:pPr>
-                        <w:jc w:val="center"/>
-                        <w:rPr>
-                          <w:sz w:val="20"/>
-                          <w:szCs w:val="20"/>
-                          <w:rtl/>
-                        </w:rPr>
-                      </w:pPr>
-                      <w:r>
-                        <w:rPr>
-                          <w:rFonts w:hint="cs"/>
-                          <w:sz w:val="20"/>
-                          <w:szCs w:val="20"/>
-                          <w:rtl/>
-                        </w:rPr>
-                        <w:t>מסעדות מועדפות</w:t>
-                      </w:r>
-                    </w:p>
-                  </w:txbxContent>
-                </v:textbox>
-                <w10:wrap type="tight" anchorx="margin"/>
-              </v:roundrect>
-            </w:pict>
-          </mc:Fallback>
-        </mc:AlternateContent>
-      </w:r>
-      <w:r>
-        <w:rPr>
-          <w:rFonts w:hint="cs"/>
-          <w:b/>
-          <w:bCs/>
-          <w:noProof/>
-          <w:sz w:val="44"/>
-          <w:szCs w:val="44"/>
-          <w:u w:val="single"/>
-          <w:rtl/>
-          <w:lang w:val="he-IL"/>
-        </w:rPr>
-        <mc:AlternateContent>
-          <mc:Choice Requires="wps">
-            <w:drawing>
-              <wp:anchor distT="0" distB="0" distL="114300" distR="114300" simplePos="0" relativeHeight="251695104" behindDoc="0" locked="0" layoutInCell="1" allowOverlap="1" wp14:anchorId="303842B3" wp14:editId="226E72D1">
-                <wp:simplePos x="0" y="0"/>
-                <wp:positionH relativeFrom="column">
-                  <wp:posOffset>-706341</wp:posOffset>
-                </wp:positionH>
-                <wp:positionV relativeFrom="paragraph">
-                  <wp:posOffset>5197834</wp:posOffset>
-                </wp:positionV>
-                <wp:extent cx="1153795" cy="510540"/>
-                <wp:effectExtent l="0" t="0" r="27305" b="22860"/>
-                <wp:wrapTight wrapText="bothSides">
-                  <wp:wrapPolygon edited="0">
-                    <wp:start x="0" y="0"/>
-                    <wp:lineTo x="0" y="21761"/>
-                    <wp:lineTo x="21755" y="21761"/>
-                    <wp:lineTo x="21755" y="0"/>
-                    <wp:lineTo x="0" y="0"/>
-                  </wp:wrapPolygon>
-                </wp:wrapTight>
-                <wp:docPr id="19" name="מלבן: פינות מעוגלות 19"/>
-                <wp:cNvGraphicFramePr/>
-                <a:graphic xmlns:a="http://schemas.openxmlformats.org/drawingml/2006/main">
-                  <a:graphicData uri="http://schemas.microsoft.com/office/word/2010/wordprocessingShape">
-                    <wps:wsp>
-                      <wps:cNvSpPr/>
-                      <wps:spPr>
-                        <a:xfrm>
-                          <a:off x="0" y="0"/>
-                          <a:ext cx="1153795" cy="510540"/>
-                        </a:xfrm>
-                        <a:prstGeom prst="roundRect">
-                          <a:avLst/>
-                        </a:prstGeom>
-                        <a:solidFill>
-                          <a:schemeClr val="accent1">
-                            <a:lumMod val="50000"/>
-                          </a:schemeClr>
-                        </a:solidFill>
-                      </wps:spPr>
-                      <wps:style>
-                        <a:lnRef idx="2">
-                          <a:schemeClr val="accent6">
-                            <a:shade val="50000"/>
-                          </a:schemeClr>
-                        </a:lnRef>
-                        <a:fillRef idx="1">
-                          <a:schemeClr val="accent6"/>
-                        </a:fillRef>
-                        <a:effectRef idx="0">
-                          <a:schemeClr val="accent6"/>
-                        </a:effectRef>
-                        <a:fontRef idx="minor">
-                          <a:schemeClr val="lt1"/>
-                        </a:fontRef>
-                      </wps:style>
-                      <wps:txbx>
-                        <w:txbxContent>
-                          <w:p>
-                            <w:pPr>
-                              <w:jc w:val="center"/>
-                              <w:rPr>
-                                <w:sz w:val="20"/>
-                                <w:szCs w:val="20"/>
-                                <w:rtl/>
-                              </w:rPr>
-                            </w:pPr>
-                            <w:r>
-                              <w:rPr>
-                                <w:rFonts w:hint="cs"/>
-                                <w:sz w:val="20"/>
-                                <w:szCs w:val="20"/>
-                                <w:rtl/>
-                              </w:rPr>
-                              <w:t>היסטוריית הזמנות</w:t>
-                            </w:r>
-                          </w:p>
-                        </w:txbxContent>
-                      </wps:txbx>
-                      <wps:bodyPr rot="0" spcFirstLastPara="0" vertOverflow="overflow" horzOverflow="overflow" vert="horz" wrap="square" lIns="91440" tIns="45720" rIns="91440" bIns="45720" numCol="1" spcCol="0" rtlCol="1" fromWordArt="0" anchor="ctr" anchorCtr="0" forceAA="0" compatLnSpc="1">
-                        <a:prstTxWarp prst="textNoShape">
-                          <a:avLst/>
-                        </a:prstTxWarp>
-                        <a:noAutofit/>
-                      </wps:bodyPr>
-                    </wps:wsp>
-                  </a:graphicData>
-                </a:graphic>
-                <wp14:sizeRelH relativeFrom="margin">
-                  <wp14:pctWidth>0</wp14:pctWidth>
-                </wp14:sizeRelH>
-                <wp14:sizeRelV relativeFrom="margin">
-                  <wp14:pctHeight>0</wp14:pctHeight>
-                </wp14:sizeRelV>
-              </wp:anchor>
-            </w:drawing>
-          </mc:Choice>
-          <mc:Fallback>
-            <w:pict>
-              <v:roundrect w14:anchorId="303842B3" id="מלבן: פינות מעוגלות 19" o:spid="_x0000_s1035" style="position:absolute;left:0;text-align:left;margin-left:-55.6pt;margin-top:409.3pt;width:90.85pt;height:40.2pt;z-index:251695104;visibility:visible;mso-wrap-style:square;mso-width-percent:0;mso-height-percent:0;mso-wrap-distance-left:9pt;mso-wrap-distance-top:0;mso-wrap-distance-right:9pt;mso-wrap-distance-bottom:0;mso-position-horizontal:absolute;mso-position-horizontal-relative:text;mso-position-vertical:absolute;mso-position-vertical-relative:text;mso-width-percent:0;mso-height-percent:0;mso-width-relative:margin;mso-height-relative:margin;v-text-anchor:middle" arcsize="10923f" o:gfxdata="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" fillcolor="#1f3763 [1604]" strokecolor="#375623 [1609]" strokeweight="1pt">
-                <v:stroke joinstyle="miter"/>
-                <v:textbox>
-                  <w:txbxContent>
-                    <w:p>
-                      <w:pPr>
-                        <w:jc w:val="center"/>
-                        <w:rPr>
-                          <w:sz w:val="20"/>
-                          <w:szCs w:val="20"/>
-                          <w:rtl/>
-                        </w:rPr>
-                      </w:pPr>
-                      <w:r>
-                        <w:rPr>
-                          <w:rFonts w:hint="cs"/>
-                          <w:sz w:val="20"/>
-                          <w:szCs w:val="20"/>
-                          <w:rtl/>
-                        </w:rPr>
-                        <w:t>היסטוריית הזמנות</w:t>
-                      </w:r>
-                    </w:p>
-                  </w:txbxContent>
-                </v:textbox>
-                <w10:wrap type="tight"/>
-              </v:roundrect>
-            </w:pict>
-          </mc:Fallback>
-        </mc:AlternateContent>
-      </w:r>
-      <w:r>
-        <w:rPr>
-          <w:rFonts w:hint="cs"/>
-          <w:b/>
-          <w:bCs/>
-          <w:noProof/>
-          <w:sz w:val="44"/>
-          <w:szCs w:val="44"/>
-          <w:u w:val="single"/>
-          <w:rtl/>
-          <w:lang w:val="he-IL"/>
-        </w:rPr>
-        <mc:AlternateContent>
-          <mc:Choice Requires="wps">
-            <w:drawing>
-              <wp:anchor distT="0" distB="0" distL="114300" distR="114300" simplePos="0" relativeHeight="251713536" behindDoc="0" locked="0" layoutInCell="1" allowOverlap="1" wp14:anchorId="54A8EB79" wp14:editId="2191DE79">
-                <wp:simplePos x="0" y="0"/>
-                <wp:positionH relativeFrom="margin">
-                  <wp:posOffset>3596833</wp:posOffset>
-                </wp:positionH>
-                <wp:positionV relativeFrom="paragraph">
-                  <wp:posOffset>5697717</wp:posOffset>
-                </wp:positionV>
-                <wp:extent cx="1153795" cy="510540"/>
-                <wp:effectExtent l="0" t="0" r="27305" b="22860"/>
-                <wp:wrapTight wrapText="bothSides">
-                  <wp:wrapPolygon edited="0">
-                    <wp:start x="0" y="0"/>
-                    <wp:lineTo x="0" y="21761"/>
-                    <wp:lineTo x="21755" y="21761"/>
-                    <wp:lineTo x="21755" y="0"/>
-                    <wp:lineTo x="0" y="0"/>
-                  </wp:wrapPolygon>
-                </wp:wrapTight>
-                <wp:docPr id="31" name="מלבן: פינות מעוגלות 31"/>
-                <wp:cNvGraphicFramePr/>
-                <a:graphic xmlns:a="http://schemas.openxmlformats.org/drawingml/2006/main">
-                  <a:graphicData uri="http://schemas.microsoft.com/office/word/2010/wordprocessingShape">
-                    <wps:wsp>
-                      <wps:cNvSpPr/>
-                      <wps:spPr>
-                        <a:xfrm>
-                          <a:off x="0" y="0"/>
-                          <a:ext cx="1153795" cy="510540"/>
-                        </a:xfrm>
-                        <a:prstGeom prst="roundRect">
-                          <a:avLst/>
-                        </a:prstGeom>
-                        <a:solidFill>
-                          <a:schemeClr val="accent1">
-                            <a:lumMod val="50000"/>
-                          </a:schemeClr>
-                        </a:solidFill>
-                      </wps:spPr>
-                      <wps:style>
-                        <a:lnRef idx="2">
-                          <a:schemeClr val="accent6">
-                            <a:shade val="50000"/>
-                          </a:schemeClr>
-                        </a:lnRef>
-                        <a:fillRef idx="1">
-                          <a:schemeClr val="accent6"/>
-                        </a:fillRef>
-                        <a:effectRef idx="0">
-                          <a:schemeClr val="accent6"/>
-                        </a:effectRef>
-                        <a:fontRef idx="minor">
-                          <a:schemeClr val="lt1"/>
-                        </a:fontRef>
-                      </wps:style>
-                      <wps:txbx>
-                        <w:txbxContent>
-                          <w:p>
-                            <w:pPr>
-                              <w:jc w:val="center"/>
-                              <w:rPr>
-                                <w:sz w:val="20"/>
-                                <w:szCs w:val="20"/>
-                                <w:rtl/>
-                              </w:rPr>
-                            </w:pPr>
-                            <w:r>
-                              <w:rPr>
-                                <w:rFonts w:hint="cs"/>
-                                <w:sz w:val="20"/>
-                                <w:szCs w:val="20"/>
-                                <w:rtl/>
-                              </w:rPr>
-                              <w:t>הזמנת מקום</w:t>
-                            </w:r>
-                          </w:p>
-                        </w:txbxContent>
-                      </wps:txbx>
-                      <wps:bodyPr rot="0" spcFirstLastPara="0" vertOverflow="overflow" horzOverflow="overflow" vert="horz" wrap="square" lIns="91440" tIns="45720" rIns="91440" bIns="45720" numCol="1" spcCol="0" rtlCol="1" fromWordArt="0" anchor="ctr" anchorCtr="0" forceAA="0" compatLnSpc="1">
-                        <a:prstTxWarp prst="textNoShape">
-                          <a:avLst/>
-                        </a:prstTxWarp>
-                        <a:noAutofit/>
-                      </wps:bodyPr>
-                    </wps:wsp>
-                  </a:graphicData>
-                </a:graphic>
-                <wp14:sizeRelH relativeFrom="margin">
-                  <wp14:pctWidth>0</wp14:pctWidth>
-                </wp14:sizeRelH>
-                <wp14:sizeRelV relativeFrom="margin">
-                  <wp14:pctHeight>0</wp14:pctHeight>
-                </wp14:sizeRelV>
-              </wp:anchor>
-            </w:drawing>
-          </mc:Choice>
-          <mc:Fallback>
-            <w:pict>
-              <v:roundrect w14:anchorId="54A8EB79" id="מלבן: פינות מעוגלות 31" o:spid="_x0000_s1036" style="position:absolute;left:0;text-align:left;margin-left:283.2pt;margin-top:448.65pt;width:90.85pt;height:40.2pt;z-index:251713536;visibility:visible;mso-wrap-style:square;mso-width-percent:0;mso-height-percent:0;mso-wrap-distance-left:9pt;mso-wrap-distance-top:0;mso-wrap-distance-right:9pt;mso-wrap-distance-bottom:0;mso-position-horizontal:absolute;mso-position-horizontal-relative:margin;mso-position-vertical:absolute;mso-position-vertical-relative:text;mso-width-percent:0;mso-height-percent:0;mso-width-relative:margin;mso-height-relative:margin;v-text-anchor:middle" arcsize="10923f" o:gfxdata="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" fillcolor="#1f3763 [1604]" strokecolor="#375623 [1609]" strokeweight="1pt">
-                <v:stroke joinstyle="miter"/>
-                <v:textbox>
-                  <w:txbxContent>
-                    <w:p>
-                      <w:pPr>
-                        <w:jc w:val="center"/>
-                        <w:rPr>
-                          <w:sz w:val="20"/>
-                          <w:szCs w:val="20"/>
-                          <w:rtl/>
-                        </w:rPr>
-                      </w:pPr>
-                      <w:r>
-                        <w:rPr>
-                          <w:rFonts w:hint="cs"/>
-                          <w:sz w:val="20"/>
-                          <w:szCs w:val="20"/>
-                          <w:rtl/>
-                        </w:rPr>
-                        <w:t>הזמנת מקום</w:t>
-                      </w:r>
-                    </w:p>
-                  </w:txbxContent>
-                </v:textbox>
-                <w10:wrap type="tight" anchorx="margin"/>
               </v:roundrect>
             </w:pict>
           </mc:Fallback>

</xml_diff>

<commit_message>
feat(): added costumer adress
</commit_message>
<xml_diff>
--- a/ArielProject/מפת אתר!.docx
+++ b/ArielProject/מפת אתר!.docx
@@ -23,28 +23,29 @@
         <mc:AlternateContent>
           <mc:Choice Requires="wps">
             <w:drawing>
-              <wp:anchor distT="0" distB="0" distL="114300" distR="114300" simplePos="0" relativeHeight="251711488" behindDoc="0" locked="0" layoutInCell="1" allowOverlap="1" wp14:anchorId="727D8BF8" wp14:editId="352A8877">
+              <wp:anchor distT="0" distB="0" distL="114300" distR="114300" simplePos="0" relativeHeight="251711488" behindDoc="0" locked="0" layoutInCell="1" allowOverlap="1" wp14:anchorId="727D8BF8" wp14:editId="156A8E69">
                 <wp:simplePos x="0" y="0"/>
                 <wp:positionH relativeFrom="column">
-                  <wp:posOffset>3832860</wp:posOffset>
+                  <wp:posOffset>3853815</wp:posOffset>
                 </wp:positionH>
                 <wp:positionV relativeFrom="paragraph">
                   <wp:posOffset>4859020</wp:posOffset>
                 </wp:positionV>
-                <wp:extent cx="377825" cy="552450"/>
-                <wp:effectExtent l="38100" t="0" r="22225" b="57150"/>
+                <wp:extent cx="351790" cy="648335"/>
+                <wp:effectExtent l="38100" t="0" r="29210" b="56515"/>
                 <wp:wrapTight wrapText="bothSides">
                   <wp:wrapPolygon edited="0">
-                    <wp:start x="18514" y="0"/>
-                    <wp:lineTo x="6534" y="0"/>
-                    <wp:lineTo x="6534" y="11917"/>
-                    <wp:lineTo x="-2178" y="11917"/>
-                    <wp:lineTo x="-2178" y="23090"/>
-                    <wp:lineTo x="3267" y="23090"/>
-                    <wp:lineTo x="13069" y="11917"/>
-                    <wp:lineTo x="21782" y="745"/>
-                    <wp:lineTo x="21782" y="0"/>
-                    <wp:lineTo x="18514" y="0"/>
+                    <wp:start x="18715" y="0"/>
+                    <wp:lineTo x="8188" y="0"/>
+                    <wp:lineTo x="8188" y="10155"/>
+                    <wp:lineTo x="-2339" y="10155"/>
+                    <wp:lineTo x="-2339" y="22848"/>
+                    <wp:lineTo x="3509" y="22848"/>
+                    <wp:lineTo x="8188" y="20310"/>
+                    <wp:lineTo x="15206" y="10155"/>
+                    <wp:lineTo x="22224" y="635"/>
+                    <wp:lineTo x="22224" y="0"/>
+                    <wp:lineTo x="18715" y="0"/>
                   </wp:wrapPolygon>
                 </wp:wrapTight>
                 <wp:docPr id="30" name="מחבר חץ ישר 30"/>
@@ -56,7 +57,7 @@
                       <wps:spPr>
                         <a:xfrm flipH="1">
                           <a:off x="0" y="0"/>
-                          <a:ext cx="377825" cy="552450"/>
+                          <a:ext cx="351790" cy="648335"/>
                         </a:xfrm>
                         <a:prstGeom prst="straightConnector1">
                           <a:avLst/>
@@ -94,11 +95,11 @@
           </mc:Choice>
           <mc:Fallback>
             <w:pict>
-              <v:shapetype w14:anchorId="5F77ECB6" id="_x0000_t32" coordsize="21600,21600" o:spt="32" o:oned="t" path="m,l21600,21600e" filled="f">
+              <v:shapetype w14:anchorId="1E41CB6D" id="_x0000_t32" coordsize="21600,21600" o:spt="32" o:oned="t" path="m,l21600,21600e" filled="f">
                 <v:path arrowok="t" fillok="f" o:connecttype="none"/>
                 <o:lock v:ext="edit" shapetype="t"/>
               </v:shapetype>
-              <v:shape id="מחבר חץ ישר 30" o:spid="_x0000_s1026" type="#_x0000_t32" style="position:absolute;margin-left:301.8pt;margin-top:382.6pt;width:29.75pt;height:43.5pt;flip:x;z-index:251711488;visibility:visible;mso-wrap-style:square;mso-width-percent:0;mso-height-percent:0;mso-wrap-distance-left:9pt;mso-wrap-distance-top:0;mso-wrap-distance-right:9pt;mso-wrap-distance-bottom:0;mso-position-horizontal:absolute;mso-position-horizontal-relative:text;mso-position-vertical:absolute;mso-position-vertical-relative:text;mso-width-percent:0;mso-height-percent:0;mso-width-relative:margin;mso-height-relative:margin" o:gfxdata="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" strokecolor="black [3200]" strokeweight=".5pt">
+              <v:shape id="מחבר חץ ישר 30" o:spid="_x0000_s1026" type="#_x0000_t32" style="position:absolute;margin-left:303.45pt;margin-top:382.6pt;width:27.7pt;height:51.05pt;flip:x;z-index:251711488;visibility:visible;mso-wrap-style:square;mso-width-percent:0;mso-height-percent:0;mso-wrap-distance-left:9pt;mso-wrap-distance-top:0;mso-wrap-distance-right:9pt;mso-wrap-distance-bottom:0;mso-position-horizontal:absolute;mso-position-horizontal-relative:text;mso-position-vertical:absolute;mso-position-vertical-relative:text;mso-width-percent:0;mso-height-percent:0;mso-width-relative:margin;mso-height-relative:margin" o:gfxdata="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" strokecolor="black [3200]" strokeweight=".5pt">
                 <v:stroke endarrow="block" joinstyle="miter"/>
                 <w10:wrap type="tight"/>
               </v:shape>
@@ -337,7 +338,7 @@
           </mc:Choice>
           <mc:Fallback>
             <w:pict>
-              <v:shape w14:anchorId="08F7B7EE" id="מחבר חץ ישר 17" o:spid="_x0000_s1026" type="#_x0000_t32" style="position:absolute;margin-left:43.95pt;margin-top:357.45pt;width:35.1pt;height:37.65pt;flip:x;z-index:251693056;visibility:visible;mso-wrap-style:square;mso-width-percent:0;mso-height-percent:0;mso-wrap-distance-left:9pt;mso-wrap-distance-top:0;mso-wrap-distance-right:9pt;mso-wrap-distance-bottom:0;mso-position-horizontal:absolute;mso-position-horizontal-relative:margin;mso-position-vertical:absolute;mso-position-vertical-relative:text;mso-width-percent:0;mso-height-percent:0;mso-width-relative:margin;mso-height-relative:margin" o:gfxdata="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" strokecolor="black [3200]" strokeweight=".5pt">
+              <v:shape w14:anchorId="6AA91715" id="מחבר חץ ישר 17" o:spid="_x0000_s1026" type="#_x0000_t32" style="position:absolute;margin-left:43.95pt;margin-top:357.45pt;width:35.1pt;height:37.65pt;flip:x;z-index:251693056;visibility:visible;mso-wrap-style:square;mso-width-percent:0;mso-height-percent:0;mso-wrap-distance-left:9pt;mso-wrap-distance-top:0;mso-wrap-distance-right:9pt;mso-wrap-distance-bottom:0;mso-position-horizontal:absolute;mso-position-horizontal-relative:margin;mso-position-vertical:absolute;mso-position-vertical-relative:text;mso-width-percent:0;mso-height-percent:0;mso-width-relative:margin;mso-height-relative:margin" o:gfxdata="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" strokecolor="black [3200]" strokeweight=".5pt">
                 <v:stroke endarrow="block" joinstyle="miter"/>
                 <w10:wrap type="tight" anchorx="margin"/>
               </v:shape>
@@ -716,7 +717,7 @@
           </mc:Choice>
           <mc:Fallback>
             <w:pict>
-              <v:shape w14:anchorId="59FAAA53" id="מחבר חץ ישר 23" o:spid="_x0000_s1026" type="#_x0000_t32" style="position:absolute;margin-left:118.45pt;margin-top:359.15pt;width:6.65pt;height:34.3pt;z-index:251703296;visibility:visible;mso-wrap-style:square;mso-width-percent:0;mso-height-percent:0;mso-wrap-distance-left:9pt;mso-wrap-distance-top:0;mso-wrap-distance-right:9pt;mso-wrap-distance-bottom:0;mso-position-horizontal:absolute;mso-position-horizontal-relative:margin;mso-position-vertical:absolute;mso-position-vertical-relative:text;mso-width-percent:0;mso-height-percent:0;mso-width-relative:margin;mso-height-relative:margin" o:gfxdata="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" strokecolor="black [3200]" strokeweight=".5pt">
+              <v:shape w14:anchorId="69D0C9B2" id="מחבר חץ ישר 23" o:spid="_x0000_s1026" type="#_x0000_t32" style="position:absolute;margin-left:118.45pt;margin-top:359.15pt;width:6.65pt;height:34.3pt;z-index:251703296;visibility:visible;mso-wrap-style:square;mso-width-percent:0;mso-height-percent:0;mso-wrap-distance-left:9pt;mso-wrap-distance-top:0;mso-wrap-distance-right:9pt;mso-wrap-distance-bottom:0;mso-position-horizontal:absolute;mso-position-horizontal-relative:margin;mso-position-vertical:absolute;mso-position-vertical-relative:text;mso-width-percent:0;mso-height-percent:0;mso-width-relative:margin;mso-height-relative:margin" o:gfxdata="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" strokecolor="black [3200]" strokeweight=".5pt">
                 <v:stroke endarrow="block" joinstyle="miter"/>
                 <w10:wrap type="tight" anchorx="margin"/>
               </v:shape>

</xml_diff>